<commit_message>
Completed tasks A5, A7, A8, A9, A10, and A11.
</commit_message>
<xml_diff>
--- a/Portfolio/Part-1-Activities.docx
+++ b/Portfolio/Part-1-Activities.docx
@@ -83,7 +83,7 @@
         <w:rPr>
           <w:rFonts w:ascii="Times New Roman" w:hAnsi="Times New Roman" w:cs="Times New Roman"/>
         </w:rPr>
-        <w:t>4</w:t>
+        <w:t>10</w:t>
       </w:r>
       <w:r>
         <w:rPr>
@@ -196,7 +196,7 @@
                     <pic:cNvPicPr/>
                   </pic:nvPicPr>
                   <pic:blipFill>
-                    <a:blip r:embed="rId4" cstate="print">
+                    <a:blip r:embed="rId5" cstate="print">
                       <a:extLst>
                         <a:ext uri="{28A0092B-C50C-407E-A947-70E740481C1C}">
                           <a14:useLocalDpi xmlns:a14="http://schemas.microsoft.com/office/drawing/2010/main" val="0"/>
@@ -267,7 +267,7 @@
                     </pic:cNvPicPr>
                   </pic:nvPicPr>
                   <pic:blipFill>
-                    <a:blip r:embed="rId5" cstate="print">
+                    <a:blip r:embed="rId6" cstate="print">
                       <a:extLst>
                         <a:ext uri="{28A0092B-C50C-407E-A947-70E740481C1C}">
                           <a14:useLocalDpi xmlns:a14="http://schemas.microsoft.com/office/drawing/2010/main" val="0"/>
@@ -405,7 +405,7 @@
                     </pic:cNvPicPr>
                   </pic:nvPicPr>
                   <pic:blipFill>
-                    <a:blip r:embed="rId6" cstate="print">
+                    <a:blip r:embed="rId7" cstate="print">
                       <a:extLst>
                         <a:ext uri="{28A0092B-C50C-407E-A947-70E740481C1C}">
                           <a14:useLocalDpi xmlns:a14="http://schemas.microsoft.com/office/drawing/2010/main" val="0"/>
@@ -483,7 +483,7 @@
                     </pic:cNvPicPr>
                   </pic:nvPicPr>
                   <pic:blipFill>
-                    <a:blip r:embed="rId7" cstate="print">
+                    <a:blip r:embed="rId8" cstate="print">
                       <a:extLst>
                         <a:ext uri="{28A0092B-C50C-407E-A947-70E740481C1C}">
                           <a14:useLocalDpi xmlns:a14="http://schemas.microsoft.com/office/drawing/2010/main" val="0"/>
@@ -593,6 +593,7 @@
           <w:rFonts w:ascii="Times New Roman" w:hAnsi="Times New Roman" w:cs="Times New Roman"/>
           <w:b/>
           <w:bCs/>
+          <w:noProof/>
         </w:rPr>
         <w:lastRenderedPageBreak/>
         <w:drawing>
@@ -611,7 +612,7 @@
                     <pic:cNvPicPr/>
                   </pic:nvPicPr>
                   <pic:blipFill>
-                    <a:blip r:embed="rId8"/>
+                    <a:blip r:embed="rId9"/>
                     <a:stretch>
                       <a:fillRect/>
                     </a:stretch>
@@ -645,7 +646,7 @@
         </w:rPr>
         <w:t>After looking around online, I found the OWASP Vulnerable Web Applications Directory (</w:t>
       </w:r>
-      <w:hyperlink r:id="rId9" w:history="1">
+      <w:hyperlink r:id="rId10" w:history="1">
         <w:r>
           <w:rPr>
             <w:rStyle w:val="Hyperlink"/>
@@ -672,7 +673,7 @@
         </w:rPr>
         <w:t>(</w:t>
       </w:r>
-      <w:hyperlink r:id="rId10" w:history="1">
+      <w:hyperlink r:id="rId11" w:history="1">
         <w:r>
           <w:rPr>
             <w:rStyle w:val="Hyperlink"/>
@@ -711,203 +712,6 @@
         <w:jc w:val="both"/>
         <w:rPr>
           <w:rFonts w:ascii="Times New Roman" w:hAnsi="Times New Roman" w:cs="Times New Roman"/>
-        </w:rPr>
-      </w:pPr>
-      <w:r>
-        <w:rPr>
-          <w:rFonts w:ascii="Times New Roman" w:hAnsi="Times New Roman" w:cs="Times New Roman"/>
-        </w:rPr>
-        <w:t>A5. Discover cryptographic implementation used online.</w:t>
-      </w:r>
-    </w:p>
-    <w:p>
-      <w:pPr>
-        <w:jc w:val="both"/>
-        <w:rPr>
-          <w:rFonts w:ascii="Times New Roman" w:hAnsi="Times New Roman" w:cs="Times New Roman"/>
-        </w:rPr>
-      </w:pPr>
-      <w:r>
-        <w:rPr>
-          <w:rFonts w:ascii="Times New Roman" w:hAnsi="Times New Roman" w:cs="Times New Roman"/>
-        </w:rPr>
-        <w:t>A6. Discover cryptographic implementation used offline.</w:t>
-      </w:r>
-    </w:p>
-    <w:p>
-      <w:pPr>
-        <w:jc w:val="both"/>
-        <w:rPr>
-          <w:rFonts w:ascii="Times New Roman" w:hAnsi="Times New Roman" w:cs="Times New Roman"/>
-        </w:rPr>
-      </w:pPr>
-      <w:r>
-        <w:rPr>
-          <w:rFonts w:ascii="Times New Roman" w:hAnsi="Times New Roman" w:cs="Times New Roman"/>
-        </w:rPr>
-        <w:t>A7. Discover cryptography used in modern networks.</w:t>
-      </w:r>
-    </w:p>
-    <w:p>
-      <w:pPr>
-        <w:jc w:val="both"/>
-        <w:rPr>
-          <w:rFonts w:ascii="Times New Roman" w:hAnsi="Times New Roman" w:cs="Times New Roman"/>
-        </w:rPr>
-      </w:pPr>
-      <w:r>
-        <w:rPr>
-          <w:rFonts w:ascii="Times New Roman" w:hAnsi="Times New Roman" w:cs="Times New Roman"/>
-        </w:rPr>
-        <w:t>A8. Discover cryptography used in Internet of Things devices.</w:t>
-      </w:r>
-    </w:p>
-    <w:p>
-      <w:pPr>
-        <w:jc w:val="both"/>
-        <w:rPr>
-          <w:rFonts w:ascii="Times New Roman" w:hAnsi="Times New Roman" w:cs="Times New Roman"/>
-        </w:rPr>
-      </w:pPr>
-      <w:r>
-        <w:rPr>
-          <w:rFonts w:ascii="Times New Roman" w:hAnsi="Times New Roman" w:cs="Times New Roman"/>
-        </w:rPr>
-        <w:t>A9. Discover privacy technique used online.</w:t>
-      </w:r>
-    </w:p>
-    <w:p>
-      <w:pPr>
-        <w:jc w:val="both"/>
-        <w:rPr>
-          <w:rFonts w:ascii="Times New Roman" w:hAnsi="Times New Roman" w:cs="Times New Roman"/>
-        </w:rPr>
-      </w:pPr>
-      <w:r>
-        <w:rPr>
-          <w:rFonts w:ascii="Times New Roman" w:hAnsi="Times New Roman" w:cs="Times New Roman"/>
-        </w:rPr>
-        <w:t>A10. Discover privacy technique used offline.</w:t>
-      </w:r>
-    </w:p>
-    <w:p>
-      <w:pPr>
-        <w:jc w:val="both"/>
-        <w:rPr>
-          <w:rFonts w:ascii="Times New Roman" w:hAnsi="Times New Roman" w:cs="Times New Roman"/>
-        </w:rPr>
-      </w:pPr>
-      <w:r>
-        <w:rPr>
-          <w:rFonts w:ascii="Times New Roman" w:hAnsi="Times New Roman" w:cs="Times New Roman"/>
-        </w:rPr>
-        <w:t>A11. Discover 5 unique access control devices.</w:t>
-      </w:r>
-    </w:p>
-    <w:p>
-      <w:pPr>
-        <w:jc w:val="both"/>
-        <w:rPr>
-          <w:rFonts w:ascii="Times New Roman" w:hAnsi="Times New Roman" w:cs="Times New Roman"/>
-        </w:rPr>
-      </w:pPr>
-      <w:r>
-        <w:rPr>
-          <w:rFonts w:ascii="Times New Roman" w:hAnsi="Times New Roman" w:cs="Times New Roman"/>
-        </w:rPr>
-        <w:t>A12. Discover 5 unique offline security tools.</w:t>
-      </w:r>
-    </w:p>
-    <w:p>
-      <w:pPr>
-        <w:jc w:val="both"/>
-        <w:rPr>
-          <w:rFonts w:ascii="Times New Roman" w:hAnsi="Times New Roman" w:cs="Times New Roman"/>
-        </w:rPr>
-      </w:pPr>
-      <w:r>
-        <w:rPr>
-          <w:rFonts w:ascii="Times New Roman" w:hAnsi="Times New Roman" w:cs="Times New Roman"/>
-        </w:rPr>
-        <w:t>A13. Discover 5 unique online security tools.</w:t>
-      </w:r>
-    </w:p>
-    <w:p>
-      <w:pPr>
-        <w:jc w:val="both"/>
-        <w:rPr>
-          <w:rFonts w:ascii="Times New Roman" w:hAnsi="Times New Roman" w:cs="Times New Roman"/>
-        </w:rPr>
-      </w:pPr>
-      <w:r>
-        <w:rPr>
-          <w:rFonts w:ascii="Times New Roman" w:hAnsi="Times New Roman" w:cs="Times New Roman"/>
-        </w:rPr>
-        <w:t>A14. Discover 5 AI-enabled security solutions.</w:t>
-      </w:r>
-    </w:p>
-    <w:p>
-      <w:pPr>
-        <w:jc w:val="both"/>
-        <w:rPr>
-          <w:rFonts w:ascii="Times New Roman" w:hAnsi="Times New Roman" w:cs="Times New Roman"/>
-        </w:rPr>
-      </w:pPr>
-      <w:r>
-        <w:rPr>
-          <w:rFonts w:ascii="Times New Roman" w:hAnsi="Times New Roman" w:cs="Times New Roman"/>
-        </w:rPr>
-        <w:t>A15. Discover 5 recent security incidents.</w:t>
-      </w:r>
-    </w:p>
-    <w:p>
-      <w:pPr>
-        <w:jc w:val="both"/>
-        <w:rPr>
-          <w:rFonts w:ascii="Times New Roman" w:hAnsi="Times New Roman" w:cs="Times New Roman"/>
-        </w:rPr>
-      </w:pPr>
-      <w:r>
-        <w:rPr>
-          <w:rFonts w:ascii="Times New Roman" w:hAnsi="Times New Roman" w:cs="Times New Roman"/>
-        </w:rPr>
-        <w:t>A16. Discover 3 local security incidents.</w:t>
-      </w:r>
-    </w:p>
-    <w:p>
-      <w:pPr>
-        <w:jc w:val="both"/>
-        <w:rPr>
-          <w:rFonts w:ascii="Times New Roman" w:hAnsi="Times New Roman" w:cs="Times New Roman"/>
-        </w:rPr>
-      </w:pPr>
-      <w:r>
-        <w:rPr>
-          <w:rFonts w:ascii="Times New Roman" w:hAnsi="Times New Roman" w:cs="Times New Roman"/>
-        </w:rPr>
-        <w:lastRenderedPageBreak/>
-        <w:t>A17. Discover 10 different types of locks in use.</w:t>
-      </w:r>
-    </w:p>
-    <w:p>
-      <w:pPr>
-        <w:jc w:val="both"/>
-        <w:rPr>
-          <w:rFonts w:ascii="Times New Roman" w:hAnsi="Times New Roman" w:cs="Times New Roman"/>
-        </w:rPr>
-      </w:pPr>
-      <w:r>
-        <w:rPr>
-          <w:rFonts w:ascii="Times New Roman" w:hAnsi="Times New Roman" w:cs="Times New Roman"/>
-        </w:rPr>
-        <w:t>A18. Discover two hallucination cases when using a generative AI system.</w:t>
-      </w:r>
-    </w:p>
-    <w:p>
-      <w:pPr>
-        <w:jc w:val="both"/>
-        <w:rPr>
-          <w:rFonts w:ascii="Times New Roman" w:hAnsi="Times New Roman" w:cs="Times New Roman"/>
           <w:b/>
           <w:bCs/>
         </w:rPr>
@@ -918,6 +722,1522 @@
           <w:b/>
           <w:bCs/>
         </w:rPr>
+        <w:t>A5. Discover cryptographic implementation used online.</w:t>
+      </w:r>
+    </w:p>
+    <w:p>
+      <w:pPr>
+        <w:jc w:val="both"/>
+        <w:rPr>
+          <w:rFonts w:ascii="Times New Roman" w:hAnsi="Times New Roman" w:cs="Times New Roman"/>
+        </w:rPr>
+      </w:pPr>
+      <w:r>
+        <w:rPr>
+          <w:rFonts w:ascii="Times New Roman" w:hAnsi="Times New Roman" w:cs="Times New Roman"/>
+        </w:rPr>
+        <w:t xml:space="preserve">Any website that stores users’ passwords don’t actually store the password themselves as plaintext, but as a cryptographic hash. </w:t>
+      </w:r>
+      <w:r>
+        <w:rPr>
+          <w:rFonts w:ascii="Times New Roman" w:hAnsi="Times New Roman" w:cs="Times New Roman"/>
+        </w:rPr>
+        <w:t>When users log in, the password they entered will be hashed and compared with the hash that is stored in the database. If the hashes match, then the user is granted access.</w:t>
+      </w:r>
+      <w:r>
+        <w:rPr>
+          <w:rFonts w:ascii="Times New Roman" w:hAnsi="Times New Roman" w:cs="Times New Roman"/>
+        </w:rPr>
+        <w:t xml:space="preserve"> </w:t>
+      </w:r>
+    </w:p>
+    <w:p>
+      <w:pPr>
+        <w:jc w:val="both"/>
+        <w:rPr>
+          <w:rFonts w:ascii="Times New Roman" w:hAnsi="Times New Roman" w:cs="Times New Roman"/>
+        </w:rPr>
+      </w:pPr>
+      <w:r>
+        <w:rPr>
+          <w:rFonts w:ascii="Times New Roman" w:hAnsi="Times New Roman" w:cs="Times New Roman"/>
+        </w:rPr>
+        <w:t>Another thing that is added to the password before it is hashed is ‘salt’, which is a random data that works as an additional input to the password, usually a few random characters, so that when the same password is hashed, it will result in a unique string every time.</w:t>
+      </w:r>
+      <w:r>
+        <w:rPr>
+          <w:rFonts w:ascii="Times New Roman" w:hAnsi="Times New Roman" w:cs="Times New Roman"/>
+        </w:rPr>
+        <w:t xml:space="preserve"> This adds a layer of security since each password needs to be cracked individually.</w:t>
+      </w:r>
+      <w:r>
+        <w:rPr>
+          <w:rFonts w:ascii="Times New Roman" w:hAnsi="Times New Roman" w:cs="Times New Roman"/>
+        </w:rPr>
+        <w:t xml:space="preserve"> </w:t>
+      </w:r>
+    </w:p>
+    <w:p>
+      <w:pPr>
+        <w:jc w:val="both"/>
+        <w:rPr>
+          <w:rFonts w:ascii="Times New Roman" w:hAnsi="Times New Roman" w:cs="Times New Roman"/>
+        </w:rPr>
+      </w:pPr>
+      <w:r>
+        <w:rPr>
+          <w:rFonts w:ascii="Times New Roman" w:hAnsi="Times New Roman" w:cs="Times New Roman"/>
+        </w:rPr>
+        <w:t>Common hash functions that are used are MD5 (Message Digest 5), which produces a fixed-length 128-bit hash value, and SHA-256 (Safe Hash Algorithm) with a hash of length 256 bits.</w:t>
+      </w:r>
+    </w:p>
+    <w:p>
+      <w:pPr>
+        <w:jc w:val="both"/>
+        <w:rPr>
+          <w:rFonts w:ascii="Times New Roman" w:hAnsi="Times New Roman" w:cs="Times New Roman"/>
+        </w:rPr>
+      </w:pPr>
+      <w:r>
+        <w:rPr>
+          <w:rFonts w:ascii="Times New Roman" w:hAnsi="Times New Roman" w:cs="Times New Roman"/>
+        </w:rPr>
+        <w:t>A6. Discover cryptographic implementation used offline.</w:t>
+      </w:r>
+    </w:p>
+    <w:p>
+      <w:pPr>
+        <w:pStyle w:val="ListParagraph"/>
+        <w:numPr>
+          <w:ilvl w:val="0"/>
+          <w:numId w:val="1"/>
+        </w:numPr>
+        <w:jc w:val="both"/>
+        <w:rPr>
+          <w:rFonts w:ascii="Times New Roman" w:hAnsi="Times New Roman" w:cs="Times New Roman"/>
+        </w:rPr>
+      </w:pPr>
+      <w:r>
+        <w:rPr>
+          <w:rFonts w:ascii="Times New Roman" w:hAnsi="Times New Roman" w:cs="Times New Roman"/>
+        </w:rPr>
+        <w:t>What is meant by offline? Like IoT devices?</w:t>
+      </w:r>
+      <w:r>
+        <w:rPr>
+          <w:rFonts w:ascii="Times New Roman" w:hAnsi="Times New Roman" w:cs="Times New Roman"/>
+        </w:rPr>
+        <w:t xml:space="preserve"> Hardware?</w:t>
+      </w:r>
+    </w:p>
+    <w:p>
+      <w:pPr>
+        <w:pStyle w:val="ListParagraph"/>
+        <w:numPr>
+          <w:ilvl w:val="0"/>
+          <w:numId w:val="1"/>
+        </w:numPr>
+        <w:jc w:val="both"/>
+        <w:rPr>
+          <w:rFonts w:ascii="Times New Roman" w:hAnsi="Times New Roman" w:cs="Times New Roman"/>
+        </w:rPr>
+      </w:pPr>
+      <w:r>
+        <w:rPr>
+          <w:rFonts w:ascii="Times New Roman" w:hAnsi="Times New Roman" w:cs="Times New Roman"/>
+        </w:rPr>
+        <w:t>Does biometric authentication like fingerprints count?</w:t>
+      </w:r>
+    </w:p>
+    <w:p>
+      <w:pPr>
+        <w:jc w:val="both"/>
+        <w:rPr>
+          <w:rFonts w:ascii="Times New Roman" w:hAnsi="Times New Roman" w:cs="Times New Roman"/>
+          <w:b/>
+          <w:bCs/>
+        </w:rPr>
+      </w:pPr>
+      <w:r>
+        <w:rPr>
+          <w:rFonts w:ascii="Times New Roman" w:hAnsi="Times New Roman" w:cs="Times New Roman"/>
+          <w:b/>
+          <w:bCs/>
+        </w:rPr>
+        <w:t>A7. Discover cryptography used in modern networks.</w:t>
+      </w:r>
+    </w:p>
+    <w:p>
+      <w:pPr>
+        <w:jc w:val="both"/>
+        <w:rPr>
+          <w:rFonts w:ascii="Times New Roman" w:hAnsi="Times New Roman" w:cs="Times New Roman"/>
+        </w:rPr>
+      </w:pPr>
+      <w:r>
+        <w:rPr>
+          <w:rFonts w:ascii="Times New Roman" w:hAnsi="Times New Roman" w:cs="Times New Roman"/>
+        </w:rPr>
+        <w:lastRenderedPageBreak/>
+        <w:t>(</w:t>
+      </w:r>
+      <w:hyperlink r:id="rId12" w:history="1">
+        <w:r>
+          <w:rPr>
+            <w:rStyle w:val="Hyperlink"/>
+            <w:rFonts w:ascii="Times New Roman" w:hAnsi="Times New Roman" w:cs="Times New Roman"/>
+          </w:rPr>
+          <w:t>https://www.ibm.com/docs/en/b2badv-communication/1.0.0?topic=overview-digital-signature</w:t>
+        </w:r>
+      </w:hyperlink>
+      <w:r>
+        <w:rPr>
+          <w:rFonts w:ascii="Times New Roman" w:hAnsi="Times New Roman" w:cs="Times New Roman"/>
+        </w:rPr>
+        <w:t xml:space="preserve">) </w:t>
+      </w:r>
+    </w:p>
+    <w:p>
+      <w:pPr>
+        <w:jc w:val="both"/>
+        <w:rPr>
+          <w:rFonts w:ascii="Times New Roman" w:hAnsi="Times New Roman" w:cs="Times New Roman"/>
+        </w:rPr>
+      </w:pPr>
+      <w:r>
+        <w:rPr>
+          <w:rFonts w:ascii="Times New Roman" w:hAnsi="Times New Roman" w:cs="Times New Roman"/>
+        </w:rPr>
+        <w:t xml:space="preserve">When sending information such as important messages or files across the internet, the receiver needs to verify the integrity of the message </w:t>
+      </w:r>
+      <w:r>
+        <w:rPr>
+          <w:rFonts w:ascii="Times New Roman" w:hAnsi="Times New Roman" w:cs="Times New Roman"/>
+        </w:rPr>
+        <w:t xml:space="preserve">(ensure end-to-end message integrity) </w:t>
+      </w:r>
+      <w:r>
+        <w:rPr>
+          <w:rFonts w:ascii="Times New Roman" w:hAnsi="Times New Roman" w:cs="Times New Roman"/>
+        </w:rPr>
+        <w:t>and whether it was actually the sender who sent it</w:t>
+      </w:r>
+      <w:r>
+        <w:rPr>
+          <w:rFonts w:ascii="Times New Roman" w:hAnsi="Times New Roman" w:cs="Times New Roman"/>
+        </w:rPr>
+        <w:t xml:space="preserve"> (authentication)</w:t>
+      </w:r>
+      <w:r>
+        <w:rPr>
+          <w:rFonts w:ascii="Times New Roman" w:hAnsi="Times New Roman" w:cs="Times New Roman"/>
+        </w:rPr>
+        <w:t>.</w:t>
+      </w:r>
+      <w:r>
+        <w:rPr>
+          <w:rFonts w:ascii="Times New Roman" w:hAnsi="Times New Roman" w:cs="Times New Roman"/>
+        </w:rPr>
+        <w:t xml:space="preserve"> To do this, a digital signature is used. </w:t>
+      </w:r>
+    </w:p>
+    <w:p>
+      <w:pPr>
+        <w:jc w:val="both"/>
+        <w:rPr>
+          <w:rFonts w:ascii="Times New Roman" w:hAnsi="Times New Roman" w:cs="Times New Roman"/>
+        </w:rPr>
+      </w:pPr>
+      <w:r>
+        <w:rPr>
+          <w:rFonts w:ascii="Times New Roman" w:hAnsi="Times New Roman" w:cs="Times New Roman"/>
+        </w:rPr>
+        <w:t>The sender will first hash the message or data they want to send via a hashing algorithm such as RSA or SHA to create a message digest</w:t>
+      </w:r>
+      <w:r>
+        <w:rPr>
+          <w:rFonts w:ascii="Times New Roman" w:hAnsi="Times New Roman" w:cs="Times New Roman"/>
+        </w:rPr>
+        <w:t xml:space="preserve"> (fixed-size hash value)</w:t>
+      </w:r>
+      <w:r>
+        <w:rPr>
+          <w:rFonts w:ascii="Times New Roman" w:hAnsi="Times New Roman" w:cs="Times New Roman"/>
+        </w:rPr>
+        <w:t>.</w:t>
+      </w:r>
+      <w:r>
+        <w:rPr>
+          <w:rFonts w:ascii="Times New Roman" w:hAnsi="Times New Roman" w:cs="Times New Roman"/>
+        </w:rPr>
+        <w:t xml:space="preserve"> Then they encrypt the digest with their private key, forming the digital signature</w:t>
+      </w:r>
+      <w:r>
+        <w:rPr>
+          <w:rFonts w:ascii="Times New Roman" w:hAnsi="Times New Roman" w:cs="Times New Roman"/>
+        </w:rPr>
+        <w:t>, and sends it alongside the message to the receiver.</w:t>
+      </w:r>
+    </w:p>
+    <w:p>
+      <w:pPr>
+        <w:jc w:val="both"/>
+        <w:rPr>
+          <w:rFonts w:ascii="Times New Roman" w:hAnsi="Times New Roman" w:cs="Times New Roman"/>
+        </w:rPr>
+      </w:pPr>
+      <w:r>
+        <w:rPr>
+          <w:rFonts w:ascii="Times New Roman" w:hAnsi="Times New Roman" w:cs="Times New Roman"/>
+        </w:rPr>
+        <w:t xml:space="preserve">The receiver decrypts the message digest they received with the public key of the sender to get the message data, which will then be used to compute a message digest so that the two digests can be compared and verified. If they are the same, then the message is authentic </w:t>
+      </w:r>
+      <w:r>
+        <w:rPr>
+          <w:rFonts w:ascii="Times New Roman" w:hAnsi="Times New Roman" w:cs="Times New Roman"/>
+        </w:rPr>
+        <w:t xml:space="preserve">(sender has been confirmed that they are indeed themselves) </w:t>
+      </w:r>
+      <w:r>
+        <w:rPr>
+          <w:rFonts w:ascii="Times New Roman" w:hAnsi="Times New Roman" w:cs="Times New Roman"/>
+        </w:rPr>
+        <w:t>and intact</w:t>
+      </w:r>
+      <w:r>
+        <w:rPr>
+          <w:rFonts w:ascii="Times New Roman" w:hAnsi="Times New Roman" w:cs="Times New Roman"/>
+        </w:rPr>
+        <w:t xml:space="preserve"> (nothing was altered or tampered with)</w:t>
+      </w:r>
+      <w:r>
+        <w:rPr>
+          <w:rFonts w:ascii="Times New Roman" w:hAnsi="Times New Roman" w:cs="Times New Roman"/>
+        </w:rPr>
+        <w:t>.</w:t>
+      </w:r>
+    </w:p>
+    <w:p>
+      <w:pPr>
+        <w:jc w:val="both"/>
+        <w:rPr>
+          <w:rFonts w:ascii="Times New Roman" w:hAnsi="Times New Roman" w:cs="Times New Roman"/>
+          <w:b/>
+          <w:bCs/>
+        </w:rPr>
+      </w:pPr>
+      <w:r>
+        <w:rPr>
+          <w:rFonts w:ascii="Times New Roman" w:hAnsi="Times New Roman" w:cs="Times New Roman"/>
+          <w:b/>
+          <w:bCs/>
+        </w:rPr>
+        <w:t>A8. Discover cryptography used in Internet of Things devices.</w:t>
+      </w:r>
+    </w:p>
+    <w:p>
+      <w:pPr>
+        <w:jc w:val="both"/>
+        <w:rPr>
+          <w:rFonts w:ascii="Times New Roman" w:hAnsi="Times New Roman" w:cs="Times New Roman"/>
+        </w:rPr>
+      </w:pPr>
+      <w:r>
+        <w:rPr>
+          <w:rFonts w:ascii="Times New Roman" w:hAnsi="Times New Roman" w:cs="Times New Roman"/>
+        </w:rPr>
+        <w:t>(</w:t>
+      </w:r>
+      <w:hyperlink r:id="rId13" w:history="1">
+        <w:r>
+          <w:rPr>
+            <w:rStyle w:val="Hyperlink"/>
+            <w:rFonts w:ascii="Times New Roman" w:hAnsi="Times New Roman" w:cs="Times New Roman"/>
+          </w:rPr>
+          <w:t>https://www.numberanalytics.com/blog/ultimate-guide-cryptography-iot</w:t>
+        </w:r>
+      </w:hyperlink>
+      <w:r>
+        <w:rPr>
+          <w:rFonts w:ascii="Times New Roman" w:hAnsi="Times New Roman" w:cs="Times New Roman"/>
+        </w:rPr>
+        <w:t xml:space="preserve">) </w:t>
+      </w:r>
+    </w:p>
+    <w:p>
+      <w:pPr>
+        <w:jc w:val="both"/>
+        <w:rPr>
+          <w:rFonts w:ascii="Times New Roman" w:hAnsi="Times New Roman" w:cs="Times New Roman"/>
+        </w:rPr>
+      </w:pPr>
+      <w:r>
+        <w:rPr>
+          <w:rFonts w:ascii="Times New Roman" w:hAnsi="Times New Roman" w:cs="Times New Roman"/>
+        </w:rPr>
+        <w:t>Internet of Things (IoT) is a network of physical devices (like appliances, vehicles) that are often equipped with sensors, software, and connectivity. The sensors allow them to collect data about their environment and exchange this data with other devices.</w:t>
+      </w:r>
+      <w:r>
+        <w:rPr>
+          <w:rFonts w:ascii="Times New Roman" w:hAnsi="Times New Roman" w:cs="Times New Roman"/>
+        </w:rPr>
+        <w:t xml:space="preserve"> The information they gather might contain sensitive data, such as location data, personal identifiable information, etc, and since IoT devices often communicate with other devices, this </w:t>
+      </w:r>
+      <w:r>
+        <w:rPr>
+          <w:rFonts w:ascii="Times New Roman" w:hAnsi="Times New Roman" w:cs="Times New Roman"/>
+        </w:rPr>
+        <w:t>transfer of data</w:t>
+      </w:r>
+      <w:r>
+        <w:rPr>
+          <w:rFonts w:ascii="Times New Roman" w:hAnsi="Times New Roman" w:cs="Times New Roman"/>
+        </w:rPr>
+        <w:t xml:space="preserve"> must be protected </w:t>
+      </w:r>
+      <w:r>
+        <w:rPr>
+          <w:rFonts w:ascii="Times New Roman" w:hAnsi="Times New Roman" w:cs="Times New Roman"/>
+        </w:rPr>
+        <w:t xml:space="preserve">and secured </w:t>
+      </w:r>
+      <w:r>
+        <w:rPr>
+          <w:rFonts w:ascii="Times New Roman" w:hAnsi="Times New Roman" w:cs="Times New Roman"/>
+        </w:rPr>
+        <w:t>against hackers trying to steal or tamper with the data.</w:t>
+      </w:r>
+    </w:p>
+    <w:p>
+      <w:pPr>
+        <w:jc w:val="both"/>
+        <w:rPr>
+          <w:rFonts w:ascii="Times New Roman" w:hAnsi="Times New Roman" w:cs="Times New Roman"/>
+        </w:rPr>
+      </w:pPr>
+      <w:r>
+        <w:rPr>
+          <w:rFonts w:ascii="Times New Roman" w:hAnsi="Times New Roman" w:cs="Times New Roman"/>
+        </w:rPr>
+        <w:t>Resource-constrained IoT devices may use symmetric key cryptography such as the AES (Advanced Encryption Standard) a block cipher, or the ChaCha20 stream cipher</w:t>
+      </w:r>
+      <w:r>
+        <w:rPr>
+          <w:rFonts w:ascii="Times New Roman" w:hAnsi="Times New Roman" w:cs="Times New Roman"/>
+        </w:rPr>
+        <w:t xml:space="preserve"> as it is fast and efficient. Other IoT devices with more processing power and storage capabilities may use asymmetric key cryptography such as RSA (Rivest-Shamir-Adleman) or Elliptic Curve Cryptography (ECC) as they are more secure, though require intensive computation.</w:t>
+      </w:r>
+    </w:p>
+    <w:p>
+      <w:pPr>
+        <w:jc w:val="both"/>
+        <w:rPr>
+          <w:rFonts w:ascii="Times New Roman" w:hAnsi="Times New Roman" w:cs="Times New Roman"/>
+          <w:b/>
+          <w:bCs/>
+        </w:rPr>
+      </w:pPr>
+      <w:r>
+        <w:rPr>
+          <w:rFonts w:ascii="Times New Roman" w:hAnsi="Times New Roman" w:cs="Times New Roman"/>
+          <w:b/>
+          <w:bCs/>
+        </w:rPr>
+        <w:t>A9. Discover privacy technique used online.</w:t>
+      </w:r>
+    </w:p>
+    <w:p>
+      <w:pPr>
+        <w:jc w:val="both"/>
+        <w:rPr>
+          <w:rFonts w:ascii="Times New Roman" w:hAnsi="Times New Roman" w:cs="Times New Roman"/>
+        </w:rPr>
+      </w:pPr>
+      <w:r>
+        <w:rPr>
+          <w:rFonts w:ascii="Times New Roman" w:hAnsi="Times New Roman" w:cs="Times New Roman"/>
+        </w:rPr>
+        <w:t>(</w:t>
+      </w:r>
+      <w:hyperlink r:id="rId14" w:history="1">
+        <w:r>
+          <w:rPr>
+            <w:rStyle w:val="Hyperlink"/>
+            <w:rFonts w:ascii="Times New Roman" w:hAnsi="Times New Roman" w:cs="Times New Roman"/>
+          </w:rPr>
+          <w:t>https://en.wikipedia.org/wiki/Privacy-enhancing_technologies</w:t>
+        </w:r>
+      </w:hyperlink>
+      <w:r>
+        <w:rPr>
+          <w:rFonts w:ascii="Times New Roman" w:hAnsi="Times New Roman" w:cs="Times New Roman"/>
+        </w:rPr>
+        <w:t xml:space="preserve">) </w:t>
+      </w:r>
+    </w:p>
+    <w:p>
+      <w:pPr>
+        <w:jc w:val="both"/>
+        <w:rPr>
+          <w:rFonts w:ascii="Times New Roman" w:hAnsi="Times New Roman" w:cs="Times New Roman"/>
+        </w:rPr>
+      </w:pPr>
+      <w:r>
+        <w:rPr>
+          <w:rFonts w:ascii="Times New Roman" w:hAnsi="Times New Roman" w:cs="Times New Roman"/>
+        </w:rPr>
+        <w:t>(</w:t>
+      </w:r>
+      <w:hyperlink r:id="rId15" w:history="1">
+        <w:r>
+          <w:rPr>
+            <w:rStyle w:val="Hyperlink"/>
+            <w:rFonts w:ascii="Times New Roman" w:hAnsi="Times New Roman" w:cs="Times New Roman"/>
+          </w:rPr>
+          <w:t>https://en.wikipedia.org/wiki/Anonymous_proxy</w:t>
+        </w:r>
+      </w:hyperlink>
+      <w:r>
+        <w:rPr>
+          <w:rFonts w:ascii="Times New Roman" w:hAnsi="Times New Roman" w:cs="Times New Roman"/>
+        </w:rPr>
+        <w:t xml:space="preserve">) </w:t>
+      </w:r>
+    </w:p>
+    <w:p>
+      <w:pPr>
+        <w:jc w:val="both"/>
+        <w:rPr>
+          <w:rFonts w:ascii="Times New Roman" w:hAnsi="Times New Roman" w:cs="Times New Roman"/>
+        </w:rPr>
+      </w:pPr>
+      <w:r>
+        <w:rPr>
+          <w:rFonts w:ascii="Times New Roman" w:hAnsi="Times New Roman" w:cs="Times New Roman"/>
+        </w:rPr>
+        <w:t xml:space="preserve">Privacy techniques </w:t>
+      </w:r>
+      <w:r>
+        <w:rPr>
+          <w:rFonts w:ascii="Times New Roman" w:hAnsi="Times New Roman" w:cs="Times New Roman"/>
+        </w:rPr>
+        <w:t xml:space="preserve">(or privacy-enhancing technologies) </w:t>
+      </w:r>
+      <w:r>
+        <w:rPr>
+          <w:rFonts w:ascii="Times New Roman" w:hAnsi="Times New Roman" w:cs="Times New Roman"/>
+        </w:rPr>
+        <w:t>are methods</w:t>
+      </w:r>
+      <w:r>
+        <w:rPr>
+          <w:rFonts w:ascii="Times New Roman" w:hAnsi="Times New Roman" w:cs="Times New Roman"/>
+        </w:rPr>
+        <w:t>/</w:t>
+      </w:r>
+      <w:r>
+        <w:rPr>
+          <w:rFonts w:ascii="Times New Roman" w:hAnsi="Times New Roman" w:cs="Times New Roman"/>
+        </w:rPr>
+        <w:t>technologies that are used</w:t>
+      </w:r>
+      <w:r>
+        <w:rPr>
+          <w:rFonts w:ascii="Times New Roman" w:hAnsi="Times New Roman" w:cs="Times New Roman"/>
+        </w:rPr>
+        <w:t xml:space="preserve"> for</w:t>
+      </w:r>
+      <w:r>
+        <w:rPr>
+          <w:rFonts w:ascii="Times New Roman" w:hAnsi="Times New Roman" w:cs="Times New Roman"/>
+        </w:rPr>
+        <w:t xml:space="preserve"> personal </w:t>
+      </w:r>
+      <w:r>
+        <w:rPr>
+          <w:rFonts w:ascii="Times New Roman" w:hAnsi="Times New Roman" w:cs="Times New Roman"/>
+        </w:rPr>
+        <w:t xml:space="preserve">data protection, </w:t>
+      </w:r>
+      <w:r>
+        <w:rPr>
+          <w:rFonts w:ascii="Times New Roman" w:hAnsi="Times New Roman" w:cs="Times New Roman"/>
+        </w:rPr>
+        <w:t>ensur</w:t>
+      </w:r>
+      <w:r>
+        <w:rPr>
+          <w:rFonts w:ascii="Times New Roman" w:hAnsi="Times New Roman" w:cs="Times New Roman"/>
+        </w:rPr>
+        <w:t xml:space="preserve">ing </w:t>
+      </w:r>
+      <w:r>
+        <w:rPr>
+          <w:rFonts w:ascii="Times New Roman" w:hAnsi="Times New Roman" w:cs="Times New Roman"/>
+        </w:rPr>
+        <w:t>that individuals can control how their data is collected, used, and shared.</w:t>
+      </w:r>
+      <w:r>
+        <w:rPr>
+          <w:rFonts w:ascii="Times New Roman" w:hAnsi="Times New Roman" w:cs="Times New Roman"/>
+        </w:rPr>
+        <w:t xml:space="preserve"> One of the ways this can be done is through communication anonymizers.</w:t>
+      </w:r>
+    </w:p>
+    <w:p>
+      <w:pPr>
+        <w:jc w:val="both"/>
+        <w:rPr>
+          <w:rFonts w:ascii="Times New Roman" w:hAnsi="Times New Roman" w:cs="Times New Roman"/>
+        </w:rPr>
+      </w:pPr>
+      <w:r>
+        <w:rPr>
+          <w:rFonts w:ascii="Times New Roman" w:hAnsi="Times New Roman" w:cs="Times New Roman"/>
+        </w:rPr>
+        <w:t>Anonymizer or anonymous proxy is a tool that attempts to hide a user’s activity on the internet and make it untraceable, acting as a proxy server computer that shields the user’s computer from the internet</w:t>
+      </w:r>
+      <w:r>
+        <w:rPr>
+          <w:rFonts w:ascii="Times New Roman" w:hAnsi="Times New Roman" w:cs="Times New Roman"/>
+        </w:rPr>
+        <w:t xml:space="preserve"> as it accesses the internet on behalf of the user.</w:t>
+      </w:r>
+      <w:r>
+        <w:rPr>
+          <w:rFonts w:ascii="Times New Roman" w:hAnsi="Times New Roman" w:cs="Times New Roman"/>
+        </w:rPr>
+        <w:t xml:space="preserve"> An example of this being done is by </w:t>
+      </w:r>
+      <w:r>
+        <w:rPr>
+          <w:rFonts w:ascii="Times New Roman" w:hAnsi="Times New Roman" w:cs="Times New Roman"/>
+        </w:rPr>
+        <w:t xml:space="preserve">Tor, which is a free overlay network for enabling anonymous communication as the </w:t>
+      </w:r>
+      <w:r>
+        <w:rPr>
+          <w:rFonts w:ascii="Times New Roman" w:hAnsi="Times New Roman" w:cs="Times New Roman"/>
+        </w:rPr>
+        <w:lastRenderedPageBreak/>
+        <w:t>information routed and content of the message are encrypted to prevent any traces of the origin and the destination</w:t>
+      </w:r>
+      <w:r>
+        <w:rPr>
+          <w:rFonts w:ascii="Times New Roman" w:hAnsi="Times New Roman" w:cs="Times New Roman"/>
+        </w:rPr>
+        <w:t xml:space="preserve"> of the traffic</w:t>
+      </w:r>
+      <w:r>
+        <w:rPr>
+          <w:rFonts w:ascii="Times New Roman" w:hAnsi="Times New Roman" w:cs="Times New Roman"/>
+        </w:rPr>
+        <w:t>, making it more difficult to trace a user’s internet activity.</w:t>
+      </w:r>
+    </w:p>
+    <w:p>
+      <w:pPr>
+        <w:jc w:val="both"/>
+        <w:rPr>
+          <w:rFonts w:ascii="Times New Roman" w:hAnsi="Times New Roman" w:cs="Times New Roman"/>
+          <w:b/>
+          <w:bCs/>
+        </w:rPr>
+      </w:pPr>
+      <w:r>
+        <w:rPr>
+          <w:rFonts w:ascii="Times New Roman" w:hAnsi="Times New Roman" w:cs="Times New Roman"/>
+          <w:b/>
+          <w:bCs/>
+        </w:rPr>
+        <w:t>A10. Discover privacy technique used offline.</w:t>
+      </w:r>
+    </w:p>
+    <w:p>
+      <w:pPr>
+        <w:jc w:val="both"/>
+        <w:rPr>
+          <w:rFonts w:ascii="Times New Roman" w:hAnsi="Times New Roman" w:cs="Times New Roman"/>
+        </w:rPr>
+      </w:pPr>
+      <w:r>
+        <w:rPr>
+          <w:rFonts w:ascii="Times New Roman" w:hAnsi="Times New Roman" w:cs="Times New Roman"/>
+        </w:rPr>
+        <w:t>Putting a password on one’s phone, whether it’d be a pattern, PIN, or alphanumeric password. Phones are now a vital source of personal information, containing apps such as social media that may store a user’s preferences and note a person’s daily life, or Gmail which contains emails commonly used to sign in to other websites and services. Not to mention that phones are also important for 2FA with apps such as Microsoft Authenticator and Okta Verify.</w:t>
+      </w:r>
+      <w:r>
+        <w:rPr>
+          <w:rFonts w:ascii="Times New Roman" w:hAnsi="Times New Roman" w:cs="Times New Roman"/>
+        </w:rPr>
+        <w:t xml:space="preserve"> Adding a password to a phone will make it harder for anyone to use and access the phone without the user’s knowledge.</w:t>
+      </w:r>
+    </w:p>
+    <w:p>
+      <w:pPr>
+        <w:jc w:val="both"/>
+        <w:rPr>
+          <w:rFonts w:ascii="Times New Roman" w:hAnsi="Times New Roman" w:cs="Times New Roman"/>
+          <w:b/>
+          <w:bCs/>
+        </w:rPr>
+      </w:pPr>
+      <w:r>
+        <w:rPr>
+          <w:rFonts w:ascii="Times New Roman" w:hAnsi="Times New Roman" w:cs="Times New Roman"/>
+          <w:b/>
+          <w:bCs/>
+        </w:rPr>
+        <w:t>A11. Discover 5 unique access control devices.</w:t>
+      </w:r>
+    </w:p>
+    <w:p>
+      <w:pPr>
+        <w:jc w:val="both"/>
+        <w:rPr>
+          <w:rFonts w:ascii="Times New Roman" w:hAnsi="Times New Roman" w:cs="Times New Roman"/>
+        </w:rPr>
+      </w:pPr>
+      <w:r>
+        <w:rPr>
+          <w:rFonts w:ascii="Times New Roman" w:hAnsi="Times New Roman" w:cs="Times New Roman"/>
+        </w:rPr>
+        <w:t xml:space="preserve">Access control systems regulate </w:t>
+      </w:r>
+      <w:r>
+        <w:rPr>
+          <w:rFonts w:ascii="Times New Roman" w:hAnsi="Times New Roman" w:cs="Times New Roman"/>
+        </w:rPr>
+        <w:t>and monitor individuals entering or exiting specific areas</w:t>
+      </w:r>
+      <w:r>
+        <w:rPr>
+          <w:rFonts w:ascii="Times New Roman" w:hAnsi="Times New Roman" w:cs="Times New Roman"/>
+        </w:rPr>
+        <w:t>,</w:t>
+      </w:r>
+      <w:r>
+        <w:rPr>
+          <w:rFonts w:ascii="Times New Roman" w:hAnsi="Times New Roman" w:cs="Times New Roman"/>
+        </w:rPr>
+        <w:t xml:space="preserve"> restricting their access based or a ruleset/permission.</w:t>
+      </w:r>
+    </w:p>
+    <w:p>
+      <w:pPr>
+        <w:pStyle w:val="ListParagraph"/>
+        <w:numPr>
+          <w:ilvl w:val="0"/>
+          <w:numId w:val="4"/>
+        </w:numPr>
+        <w:jc w:val="both"/>
+        <w:rPr>
+          <w:rFonts w:ascii="Times New Roman" w:hAnsi="Times New Roman" w:cs="Times New Roman"/>
+        </w:rPr>
+      </w:pPr>
+      <w:r>
+        <w:rPr>
+          <w:rFonts w:ascii="Times New Roman" w:hAnsi="Times New Roman" w:cs="Times New Roman"/>
+          <w:b/>
+          <w:bCs/>
+        </w:rPr>
+        <w:t>Turnstiles</w:t>
+      </w:r>
+      <w:r>
+        <w:rPr>
+          <w:rFonts w:ascii="Times New Roman" w:hAnsi="Times New Roman" w:cs="Times New Roman"/>
+        </w:rPr>
+        <w:t xml:space="preserve">: </w:t>
+      </w:r>
+      <w:r>
+        <w:rPr>
+          <w:rFonts w:ascii="Times New Roman" w:hAnsi="Times New Roman" w:cs="Times New Roman"/>
+        </w:rPr>
+        <w:t>A</w:t>
+      </w:r>
+      <w:r>
+        <w:rPr>
+          <w:rFonts w:ascii="Times New Roman" w:hAnsi="Times New Roman" w:cs="Times New Roman"/>
+        </w:rPr>
+        <w:t xml:space="preserve"> form of gate that allows one person to pass at a time, can restrict </w:t>
+      </w:r>
+      <w:r>
+        <w:rPr>
+          <w:rFonts w:ascii="Times New Roman" w:hAnsi="Times New Roman" w:cs="Times New Roman"/>
+        </w:rPr>
+        <w:t>passage to people who provide a specific method of payment (such as coin, ticket, transit pass) or a specific method of verification (such as security credentials). An example of this being used is in Transperth public transportation, where passengers can only ride the bus or train via payment through contactless payment, purchased ticket, or the Smart</w:t>
+      </w:r>
+      <w:r>
+        <w:rPr>
+          <w:rFonts w:ascii="Times New Roman" w:hAnsi="Times New Roman" w:cs="Times New Roman"/>
+        </w:rPr>
+        <w:t>R</w:t>
+      </w:r>
+      <w:r>
+        <w:rPr>
+          <w:rFonts w:ascii="Times New Roman" w:hAnsi="Times New Roman" w:cs="Times New Roman"/>
+        </w:rPr>
+        <w:t>ider card.</w:t>
+      </w:r>
+    </w:p>
+    <w:p>
+      <w:pPr>
+        <w:pStyle w:val="ListParagraph"/>
+        <w:numPr>
+          <w:ilvl w:val="0"/>
+          <w:numId w:val="4"/>
+        </w:numPr>
+        <w:jc w:val="both"/>
+        <w:rPr>
+          <w:rFonts w:ascii="Times New Roman" w:hAnsi="Times New Roman" w:cs="Times New Roman"/>
+        </w:rPr>
+      </w:pPr>
+      <w:r>
+        <w:rPr>
+          <w:rFonts w:ascii="Times New Roman" w:hAnsi="Times New Roman" w:cs="Times New Roman"/>
+          <w:b/>
+          <w:bCs/>
+        </w:rPr>
+        <w:t>Biometric</w:t>
+      </w:r>
+      <w:r>
+        <w:rPr>
+          <w:rFonts w:ascii="Times New Roman" w:hAnsi="Times New Roman" w:cs="Times New Roman"/>
+        </w:rPr>
+        <w:t xml:space="preserve"> </w:t>
+      </w:r>
+      <w:r>
+        <w:rPr>
+          <w:rFonts w:ascii="Times New Roman" w:hAnsi="Times New Roman" w:cs="Times New Roman"/>
+          <w:b/>
+          <w:bCs/>
+        </w:rPr>
+        <w:t>scanners</w:t>
+      </w:r>
+      <w:r>
+        <w:rPr>
+          <w:rFonts w:ascii="Times New Roman" w:hAnsi="Times New Roman" w:cs="Times New Roman"/>
+        </w:rPr>
+        <w:t>:</w:t>
+      </w:r>
+      <w:r>
+        <w:rPr>
+          <w:rFonts w:ascii="Times New Roman" w:hAnsi="Times New Roman" w:cs="Times New Roman"/>
+        </w:rPr>
+        <w:t xml:space="preserve"> </w:t>
+      </w:r>
+      <w:r>
+        <w:rPr>
+          <w:rFonts w:ascii="Times New Roman" w:hAnsi="Times New Roman" w:cs="Times New Roman"/>
+        </w:rPr>
+        <w:t>B</w:t>
+      </w:r>
+      <w:r>
+        <w:rPr>
+          <w:rFonts w:ascii="Times New Roman" w:hAnsi="Times New Roman" w:cs="Times New Roman"/>
+        </w:rPr>
+        <w:t>iometrics are unique, biological identifiers of a person</w:t>
+      </w:r>
+      <w:r>
+        <w:rPr>
+          <w:rFonts w:ascii="Times New Roman" w:hAnsi="Times New Roman" w:cs="Times New Roman"/>
+        </w:rPr>
+        <w:t xml:space="preserve"> such as </w:t>
+      </w:r>
+      <w:r>
+        <w:rPr>
+          <w:rFonts w:ascii="Times New Roman" w:hAnsi="Times New Roman" w:cs="Times New Roman"/>
+        </w:rPr>
+        <w:t>fingerprint</w:t>
+      </w:r>
+      <w:r>
+        <w:rPr>
+          <w:rFonts w:ascii="Times New Roman" w:hAnsi="Times New Roman" w:cs="Times New Roman"/>
+        </w:rPr>
+        <w:t>s</w:t>
+      </w:r>
+      <w:r>
+        <w:rPr>
+          <w:rFonts w:ascii="Times New Roman" w:hAnsi="Times New Roman" w:cs="Times New Roman"/>
+        </w:rPr>
+        <w:t>, facial recognition, iris</w:t>
+      </w:r>
+      <w:r>
+        <w:rPr>
+          <w:rFonts w:ascii="Times New Roman" w:hAnsi="Times New Roman" w:cs="Times New Roman"/>
+        </w:rPr>
+        <w:t xml:space="preserve"> scanners</w:t>
+      </w:r>
+      <w:r>
+        <w:rPr>
+          <w:rFonts w:ascii="Times New Roman" w:hAnsi="Times New Roman" w:cs="Times New Roman"/>
+        </w:rPr>
+        <w:t>. An example of this is in the lock screen of a mobile phone, which offers the option to unlock it through fingerprint scanning.</w:t>
+      </w:r>
+    </w:p>
+    <w:p>
+      <w:pPr>
+        <w:pStyle w:val="ListParagraph"/>
+        <w:numPr>
+          <w:ilvl w:val="0"/>
+          <w:numId w:val="4"/>
+        </w:numPr>
+        <w:jc w:val="both"/>
+        <w:rPr>
+          <w:rFonts w:ascii="Times New Roman" w:hAnsi="Times New Roman" w:cs="Times New Roman"/>
+        </w:rPr>
+      </w:pPr>
+      <w:r>
+        <w:rPr>
+          <w:rFonts w:ascii="Times New Roman" w:hAnsi="Times New Roman" w:cs="Times New Roman"/>
+          <w:b/>
+          <w:bCs/>
+        </w:rPr>
+        <w:t>Smart</w:t>
+      </w:r>
+      <w:r>
+        <w:rPr>
+          <w:rFonts w:ascii="Times New Roman" w:hAnsi="Times New Roman" w:cs="Times New Roman"/>
+        </w:rPr>
+        <w:t xml:space="preserve"> </w:t>
+      </w:r>
+      <w:r>
+        <w:rPr>
+          <w:rFonts w:ascii="Times New Roman" w:hAnsi="Times New Roman" w:cs="Times New Roman"/>
+          <w:b/>
+          <w:bCs/>
+        </w:rPr>
+        <w:t>locks</w:t>
+      </w:r>
+      <w:r>
+        <w:rPr>
+          <w:rFonts w:ascii="Times New Roman" w:hAnsi="Times New Roman" w:cs="Times New Roman"/>
+        </w:rPr>
+        <w:t>:</w:t>
+      </w:r>
+      <w:r>
+        <w:rPr>
+          <w:rFonts w:ascii="Times New Roman" w:hAnsi="Times New Roman" w:cs="Times New Roman"/>
+        </w:rPr>
+        <w:t xml:space="preserve"> </w:t>
+      </w:r>
+      <w:r>
+        <w:rPr>
+          <w:rFonts w:ascii="Times New Roman" w:hAnsi="Times New Roman" w:cs="Times New Roman"/>
+        </w:rPr>
+        <w:t>A</w:t>
+      </w:r>
+      <w:r>
+        <w:rPr>
+          <w:rFonts w:ascii="Times New Roman" w:hAnsi="Times New Roman" w:cs="Times New Roman"/>
+        </w:rPr>
+        <w:t xml:space="preserve">n electromechanical lock </w:t>
+      </w:r>
+      <w:r>
+        <w:rPr>
+          <w:rFonts w:ascii="Times New Roman" w:hAnsi="Times New Roman" w:cs="Times New Roman"/>
+        </w:rPr>
+        <w:t>that uses advanced technology to lock and unlock a door, with other functions to monitor access and send alerts in response to the events it monitors. They key used to unlock the lock is virtual, either a smartphone, a key fob, or keycard specifically configured to perform authentication and thus granting access. An example of this can be found in smart homes.</w:t>
+      </w:r>
+    </w:p>
+    <w:p>
+      <w:pPr>
+        <w:pStyle w:val="ListParagraph"/>
+        <w:numPr>
+          <w:ilvl w:val="0"/>
+          <w:numId w:val="4"/>
+        </w:numPr>
+        <w:jc w:val="both"/>
+        <w:rPr>
+          <w:rFonts w:ascii="Times New Roman" w:hAnsi="Times New Roman" w:cs="Times New Roman"/>
+        </w:rPr>
+      </w:pPr>
+      <w:r>
+        <w:rPr>
+          <w:rFonts w:ascii="Times New Roman" w:hAnsi="Times New Roman" w:cs="Times New Roman"/>
+          <w:b/>
+          <w:bCs/>
+        </w:rPr>
+        <w:t>Card</w:t>
+      </w:r>
+      <w:r>
+        <w:rPr>
+          <w:rFonts w:ascii="Times New Roman" w:hAnsi="Times New Roman" w:cs="Times New Roman"/>
+        </w:rPr>
+        <w:t xml:space="preserve"> </w:t>
+      </w:r>
+      <w:r>
+        <w:rPr>
+          <w:rFonts w:ascii="Times New Roman" w:hAnsi="Times New Roman" w:cs="Times New Roman"/>
+          <w:b/>
+          <w:bCs/>
+        </w:rPr>
+        <w:t>reader</w:t>
+      </w:r>
+      <w:r>
+        <w:rPr>
+          <w:rFonts w:ascii="Times New Roman" w:hAnsi="Times New Roman" w:cs="Times New Roman"/>
+        </w:rPr>
+        <w:t>:</w:t>
+      </w:r>
+      <w:r>
+        <w:rPr>
+          <w:rFonts w:ascii="Times New Roman" w:hAnsi="Times New Roman" w:cs="Times New Roman"/>
+        </w:rPr>
+        <w:t xml:space="preserve"> A data input device that reads data from a card. </w:t>
+      </w:r>
+      <w:r>
+        <w:rPr>
+          <w:rFonts w:ascii="Times New Roman" w:hAnsi="Times New Roman" w:cs="Times New Roman"/>
+        </w:rPr>
+        <w:t>There are many types of card readers, such as magnetic card readers (acquire data from the magnetic oxide tape stripe on a card), optical card readers (like from barcodes), and smart card readers (</w:t>
+      </w:r>
+      <w:r>
+        <w:rPr>
+          <w:rFonts w:ascii="Times New Roman" w:hAnsi="Times New Roman" w:cs="Times New Roman"/>
+        </w:rPr>
+        <w:t>for example, the card readers that scan</w:t>
+      </w:r>
+      <w:r>
+        <w:rPr>
+          <w:rFonts w:ascii="Times New Roman" w:hAnsi="Times New Roman" w:cs="Times New Roman"/>
+        </w:rPr>
+        <w:t xml:space="preserve"> </w:t>
+      </w:r>
+      <w:r>
+        <w:rPr>
+          <w:rFonts w:ascii="Times New Roman" w:hAnsi="Times New Roman" w:cs="Times New Roman"/>
+        </w:rPr>
+        <w:t>campus card</w:t>
+      </w:r>
+      <w:r>
+        <w:rPr>
+          <w:rFonts w:ascii="Times New Roman" w:hAnsi="Times New Roman" w:cs="Times New Roman"/>
+        </w:rPr>
+        <w:t>s</w:t>
+      </w:r>
+      <w:r>
+        <w:rPr>
+          <w:rFonts w:ascii="Times New Roman" w:hAnsi="Times New Roman" w:cs="Times New Roman"/>
+        </w:rPr>
+        <w:t xml:space="preserve"> in university)</w:t>
+      </w:r>
+    </w:p>
+    <w:p>
+      <w:pPr>
+        <w:pStyle w:val="ListParagraph"/>
+        <w:numPr>
+          <w:ilvl w:val="0"/>
+          <w:numId w:val="4"/>
+        </w:numPr>
+        <w:jc w:val="both"/>
+        <w:rPr>
+          <w:rFonts w:ascii="Times New Roman" w:hAnsi="Times New Roman" w:cs="Times New Roman"/>
+        </w:rPr>
+      </w:pPr>
+      <w:r>
+        <w:rPr>
+          <w:rFonts w:ascii="Times New Roman" w:hAnsi="Times New Roman" w:cs="Times New Roman"/>
+          <w:b/>
+          <w:bCs/>
+        </w:rPr>
+        <w:t>Keypads</w:t>
+      </w:r>
+      <w:r>
+        <w:rPr>
+          <w:rFonts w:ascii="Times New Roman" w:hAnsi="Times New Roman" w:cs="Times New Roman"/>
+        </w:rPr>
+        <w:t>:</w:t>
+      </w:r>
+      <w:r>
+        <w:rPr>
+          <w:rFonts w:ascii="Times New Roman" w:hAnsi="Times New Roman" w:cs="Times New Roman"/>
+        </w:rPr>
+        <w:t xml:space="preserve"> A set of buttons (digits, symbols, or alphabetical letters) arranged in a block. Often used in either door access control systems, or ATMs to enter PIN to access the user’s account.</w:t>
+      </w:r>
+    </w:p>
+    <w:p>
+      <w:pPr>
+        <w:jc w:val="both"/>
+        <w:rPr>
+          <w:rFonts w:ascii="Times New Roman" w:hAnsi="Times New Roman" w:cs="Times New Roman"/>
+        </w:rPr>
+      </w:pPr>
+      <w:r>
+        <w:rPr>
+          <w:rFonts w:ascii="Times New Roman" w:hAnsi="Times New Roman" w:cs="Times New Roman"/>
+        </w:rPr>
+        <w:t>A12. Discover 5 unique offline security tools.</w:t>
+      </w:r>
+    </w:p>
+    <w:p>
+      <w:pPr>
+        <w:pStyle w:val="ListParagraph"/>
+        <w:numPr>
+          <w:ilvl w:val="0"/>
+          <w:numId w:val="6"/>
+        </w:numPr>
+        <w:jc w:val="both"/>
+        <w:rPr>
+          <w:rFonts w:ascii="Times New Roman" w:hAnsi="Times New Roman" w:cs="Times New Roman"/>
+        </w:rPr>
+      </w:pPr>
+      <w:r>
+        <w:rPr>
+          <w:rFonts w:ascii="Times New Roman" w:hAnsi="Times New Roman" w:cs="Times New Roman"/>
+        </w:rPr>
+        <w:t>What does offline mean in this case??</w:t>
+      </w:r>
+    </w:p>
+    <w:p>
+      <w:pPr>
+        <w:jc w:val="both"/>
+        <w:rPr>
+          <w:rFonts w:ascii="Times New Roman" w:hAnsi="Times New Roman" w:cs="Times New Roman"/>
+        </w:rPr>
+      </w:pPr>
+      <w:r>
+        <w:rPr>
+          <w:rFonts w:ascii="Times New Roman" w:hAnsi="Times New Roman" w:cs="Times New Roman"/>
+        </w:rPr>
+        <w:t>A13. Discover 5 unique online security tools.</w:t>
+      </w:r>
+    </w:p>
+    <w:p>
+      <w:pPr>
+        <w:pStyle w:val="ListParagraph"/>
+        <w:numPr>
+          <w:ilvl w:val="0"/>
+          <w:numId w:val="5"/>
+        </w:numPr>
+        <w:jc w:val="both"/>
+        <w:rPr>
+          <w:rFonts w:ascii="Times New Roman" w:hAnsi="Times New Roman" w:cs="Times New Roman"/>
+        </w:rPr>
+      </w:pPr>
+      <w:r>
+        <w:rPr>
+          <w:rFonts w:ascii="Times New Roman" w:hAnsi="Times New Roman" w:cs="Times New Roman"/>
+        </w:rPr>
+        <w:t>Specific brand name</w:t>
+      </w:r>
+      <w:r>
+        <w:rPr>
+          <w:rFonts w:ascii="Times New Roman" w:hAnsi="Times New Roman" w:cs="Times New Roman"/>
+        </w:rPr>
+        <w:t xml:space="preserve"> (“Have I been pwned”)</w:t>
+      </w:r>
+      <w:r>
+        <w:rPr>
+          <w:rFonts w:ascii="Times New Roman" w:hAnsi="Times New Roman" w:cs="Times New Roman"/>
+        </w:rPr>
+        <w:t>? Or general “firewall”, “VPN”, “antivirus”</w:t>
+      </w:r>
+      <w:r>
+        <w:rPr>
+          <w:rFonts w:ascii="Times New Roman" w:hAnsi="Times New Roman" w:cs="Times New Roman"/>
+        </w:rPr>
+        <w:t>, “password checkers”</w:t>
+      </w:r>
+      <w:r>
+        <w:rPr>
+          <w:rFonts w:ascii="Times New Roman" w:hAnsi="Times New Roman" w:cs="Times New Roman"/>
+        </w:rPr>
+        <w:t>, “website security scanners”</w:t>
+      </w:r>
+    </w:p>
+    <w:p>
+      <w:pPr>
+        <w:jc w:val="both"/>
+        <w:rPr>
+          <w:rFonts w:ascii="Times New Roman" w:hAnsi="Times New Roman" w:cs="Times New Roman"/>
+        </w:rPr>
+      </w:pPr>
+      <w:r>
+        <w:rPr>
+          <w:rFonts w:ascii="Times New Roman" w:hAnsi="Times New Roman" w:cs="Times New Roman"/>
+        </w:rPr>
+        <w:lastRenderedPageBreak/>
+        <w:t>A14. Discover 5 AI-enabled security solutions.</w:t>
+      </w:r>
+    </w:p>
+    <w:p>
+      <w:pPr>
+        <w:jc w:val="both"/>
+        <w:rPr>
+          <w:rFonts w:ascii="Times New Roman" w:hAnsi="Times New Roman" w:cs="Times New Roman"/>
+        </w:rPr>
+      </w:pPr>
+      <w:r>
+        <w:rPr>
+          <w:rFonts w:ascii="Times New Roman" w:hAnsi="Times New Roman" w:cs="Times New Roman"/>
+        </w:rPr>
+        <w:t>A15. Discover 5 recent security incidents.</w:t>
+      </w:r>
+    </w:p>
+    <w:p>
+      <w:pPr>
+        <w:jc w:val="both"/>
+        <w:rPr>
+          <w:rFonts w:ascii="Times New Roman" w:hAnsi="Times New Roman" w:cs="Times New Roman"/>
+        </w:rPr>
+      </w:pPr>
+      <w:r>
+        <w:rPr>
+          <w:rFonts w:ascii="Times New Roman" w:hAnsi="Times New Roman" w:cs="Times New Roman"/>
+        </w:rPr>
+        <w:t>(</w:t>
+      </w:r>
+      <w:hyperlink r:id="rId16" w:history="1">
+        <w:r>
+          <w:rPr>
+            <w:rStyle w:val="Hyperlink"/>
+            <w:rFonts w:ascii="Times New Roman" w:hAnsi="Times New Roman" w:cs="Times New Roman"/>
+          </w:rPr>
+          <w:t>https://cybersecuritynews.com/category/cyber-attack-news/</w:t>
+        </w:r>
+      </w:hyperlink>
+      <w:r>
+        <w:rPr>
+          <w:rFonts w:ascii="Times New Roman" w:hAnsi="Times New Roman" w:cs="Times New Roman"/>
+        </w:rPr>
+        <w:t xml:space="preserve">) </w:t>
+      </w:r>
+    </w:p>
+    <w:p>
+      <w:pPr>
+        <w:jc w:val="both"/>
+        <w:rPr>
+          <w:rFonts w:ascii="Times New Roman" w:hAnsi="Times New Roman" w:cs="Times New Roman"/>
+        </w:rPr>
+      </w:pPr>
+      <w:r>
+        <w:rPr>
+          <w:rFonts w:ascii="Times New Roman" w:hAnsi="Times New Roman" w:cs="Times New Roman"/>
+        </w:rPr>
+        <w:t>(</w:t>
+      </w:r>
+      <w:hyperlink r:id="rId17" w:history="1">
+        <w:r>
+          <w:rPr>
+            <w:rStyle w:val="Hyperlink"/>
+            <w:rFonts w:ascii="Times New Roman" w:hAnsi="Times New Roman" w:cs="Times New Roman"/>
+          </w:rPr>
+          <w:t>https://www.cyber.gov.au/about-us/view-all-content/alerts-and-advisories</w:t>
+        </w:r>
+      </w:hyperlink>
+      <w:r>
+        <w:rPr>
+          <w:rFonts w:ascii="Times New Roman" w:hAnsi="Times New Roman" w:cs="Times New Roman"/>
+        </w:rPr>
+        <w:t xml:space="preserve">) </w:t>
+      </w:r>
+    </w:p>
+    <w:p>
+      <w:pPr>
+        <w:pStyle w:val="ListParagraph"/>
+        <w:numPr>
+          <w:ilvl w:val="0"/>
+          <w:numId w:val="1"/>
+        </w:numPr>
+        <w:jc w:val="both"/>
+        <w:rPr>
+          <w:rFonts w:ascii="Times New Roman" w:hAnsi="Times New Roman" w:cs="Times New Roman"/>
+        </w:rPr>
+      </w:pPr>
+      <w:r>
+        <w:rPr>
+          <w:rFonts w:ascii="Times New Roman" w:hAnsi="Times New Roman" w:cs="Times New Roman"/>
+        </w:rPr>
+        <w:t>How recent is “recent”? Within a year? 5 years?</w:t>
+      </w:r>
+    </w:p>
+    <w:p>
+      <w:pPr>
+        <w:jc w:val="both"/>
+        <w:rPr>
+          <w:rFonts w:ascii="Times New Roman" w:hAnsi="Times New Roman" w:cs="Times New Roman"/>
+        </w:rPr>
+      </w:pPr>
+      <w:r>
+        <w:rPr>
+          <w:rFonts w:ascii="Times New Roman" w:hAnsi="Times New Roman" w:cs="Times New Roman"/>
+        </w:rPr>
+        <w:t>A16. Discover 3 local security incidents.</w:t>
+      </w:r>
+    </w:p>
+    <w:p>
+      <w:pPr>
+        <w:jc w:val="both"/>
+        <w:rPr>
+          <w:rFonts w:ascii="Times New Roman" w:hAnsi="Times New Roman" w:cs="Times New Roman"/>
+          <w:b/>
+          <w:bCs/>
+        </w:rPr>
+      </w:pPr>
+      <w:r>
+        <w:rPr>
+          <w:rFonts w:ascii="Times New Roman" w:hAnsi="Times New Roman" w:cs="Times New Roman"/>
+          <w:b/>
+          <w:bCs/>
+        </w:rPr>
+        <w:t>A17. Discover 10 different types of locks in use.</w:t>
+      </w:r>
+    </w:p>
+    <w:p>
+      <w:pPr>
+        <w:jc w:val="both"/>
+        <w:rPr>
+          <w:rFonts w:ascii="Times New Roman" w:hAnsi="Times New Roman" w:cs="Times New Roman"/>
+        </w:rPr>
+      </w:pPr>
+      <w:r>
+        <w:rPr>
+          <w:rFonts w:ascii="Times New Roman" w:hAnsi="Times New Roman" w:cs="Times New Roman"/>
+        </w:rPr>
+        <w:t>(</w:t>
+      </w:r>
+      <w:hyperlink r:id="rId18" w:history="1">
+        <w:r>
+          <w:rPr>
+            <w:rStyle w:val="Hyperlink"/>
+            <w:rFonts w:ascii="Times New Roman" w:hAnsi="Times New Roman" w:cs="Times New Roman"/>
+          </w:rPr>
+          <w:t>https://www.art-of-lockpicking.com/types-of-locks/</w:t>
+        </w:r>
+      </w:hyperlink>
+      <w:r>
+        <w:rPr>
+          <w:rFonts w:ascii="Times New Roman" w:hAnsi="Times New Roman" w:cs="Times New Roman"/>
+        </w:rPr>
+        <w:t xml:space="preserve">) </w:t>
+      </w:r>
+    </w:p>
+    <w:p>
+      <w:pPr>
+        <w:pStyle w:val="ListParagraph"/>
+        <w:numPr>
+          <w:ilvl w:val="0"/>
+          <w:numId w:val="2"/>
+        </w:numPr>
+        <w:jc w:val="both"/>
+        <w:rPr>
+          <w:rFonts w:ascii="Times New Roman" w:hAnsi="Times New Roman" w:cs="Times New Roman"/>
+        </w:rPr>
+      </w:pPr>
+      <w:r>
+        <w:rPr>
+          <w:rFonts w:ascii="Times New Roman" w:hAnsi="Times New Roman" w:cs="Times New Roman"/>
+        </w:rPr>
+        <w:t>Padlocks</w:t>
+      </w:r>
+    </w:p>
+    <w:p>
+      <w:pPr>
+        <w:pStyle w:val="ListParagraph"/>
+        <w:numPr>
+          <w:ilvl w:val="0"/>
+          <w:numId w:val="2"/>
+        </w:numPr>
+        <w:jc w:val="both"/>
+        <w:rPr>
+          <w:rFonts w:ascii="Times New Roman" w:hAnsi="Times New Roman" w:cs="Times New Roman"/>
+        </w:rPr>
+      </w:pPr>
+      <w:r>
+        <w:rPr>
+          <w:rFonts w:ascii="Times New Roman" w:hAnsi="Times New Roman" w:cs="Times New Roman"/>
+        </w:rPr>
+        <w:t>De</w:t>
+      </w:r>
+      <w:r>
+        <w:rPr>
+          <w:rFonts w:ascii="Times New Roman" w:hAnsi="Times New Roman" w:cs="Times New Roman"/>
+        </w:rPr>
+        <w:t>adbolts</w:t>
+      </w:r>
+    </w:p>
+    <w:p>
+      <w:pPr>
+        <w:pStyle w:val="ListParagraph"/>
+        <w:numPr>
+          <w:ilvl w:val="0"/>
+          <w:numId w:val="2"/>
+        </w:numPr>
+        <w:jc w:val="both"/>
+        <w:rPr>
+          <w:rFonts w:ascii="Times New Roman" w:hAnsi="Times New Roman" w:cs="Times New Roman"/>
+        </w:rPr>
+      </w:pPr>
+      <w:r>
+        <w:rPr>
+          <w:rFonts w:ascii="Times New Roman" w:hAnsi="Times New Roman" w:cs="Times New Roman"/>
+        </w:rPr>
+        <w:t>Smart Locks</w:t>
+      </w:r>
+    </w:p>
+    <w:p>
+      <w:pPr>
+        <w:pStyle w:val="ListParagraph"/>
+        <w:numPr>
+          <w:ilvl w:val="0"/>
+          <w:numId w:val="2"/>
+        </w:numPr>
+        <w:jc w:val="both"/>
+        <w:rPr>
+          <w:rFonts w:ascii="Times New Roman" w:hAnsi="Times New Roman" w:cs="Times New Roman"/>
+        </w:rPr>
+      </w:pPr>
+      <w:r>
+        <w:rPr>
+          <w:rFonts w:ascii="Times New Roman" w:hAnsi="Times New Roman" w:cs="Times New Roman"/>
+        </w:rPr>
+        <w:t>Door Knob Locks</w:t>
+      </w:r>
+    </w:p>
+    <w:p>
+      <w:pPr>
+        <w:pStyle w:val="ListParagraph"/>
+        <w:numPr>
+          <w:ilvl w:val="0"/>
+          <w:numId w:val="2"/>
+        </w:numPr>
+        <w:jc w:val="both"/>
+        <w:rPr>
+          <w:rFonts w:ascii="Times New Roman" w:hAnsi="Times New Roman" w:cs="Times New Roman"/>
+        </w:rPr>
+      </w:pPr>
+      <w:r>
+        <w:rPr>
+          <w:rFonts w:ascii="Times New Roman" w:hAnsi="Times New Roman" w:cs="Times New Roman"/>
+        </w:rPr>
+        <w:t>Lever Handle Locks</w:t>
+      </w:r>
+    </w:p>
+    <w:p>
+      <w:pPr>
+        <w:pStyle w:val="ListParagraph"/>
+        <w:numPr>
+          <w:ilvl w:val="0"/>
+          <w:numId w:val="2"/>
+        </w:numPr>
+        <w:jc w:val="both"/>
+        <w:rPr>
+          <w:rFonts w:ascii="Times New Roman" w:hAnsi="Times New Roman" w:cs="Times New Roman"/>
+        </w:rPr>
+      </w:pPr>
+      <w:r>
+        <w:rPr>
+          <w:rFonts w:ascii="Times New Roman" w:hAnsi="Times New Roman" w:cs="Times New Roman"/>
+        </w:rPr>
+        <w:t>Cam Locks</w:t>
+      </w:r>
+    </w:p>
+    <w:p>
+      <w:pPr>
+        <w:pStyle w:val="ListParagraph"/>
+        <w:numPr>
+          <w:ilvl w:val="0"/>
+          <w:numId w:val="2"/>
+        </w:numPr>
+        <w:jc w:val="both"/>
+        <w:rPr>
+          <w:rFonts w:ascii="Times New Roman" w:hAnsi="Times New Roman" w:cs="Times New Roman"/>
+        </w:rPr>
+      </w:pPr>
+      <w:r>
+        <w:rPr>
+          <w:rFonts w:ascii="Times New Roman" w:hAnsi="Times New Roman" w:cs="Times New Roman"/>
+        </w:rPr>
+        <w:t>Mortise Locks</w:t>
+      </w:r>
+    </w:p>
+    <w:p>
+      <w:pPr>
+        <w:pStyle w:val="ListParagraph"/>
+        <w:numPr>
+          <w:ilvl w:val="0"/>
+          <w:numId w:val="2"/>
+        </w:numPr>
+        <w:jc w:val="both"/>
+        <w:rPr>
+          <w:rFonts w:ascii="Times New Roman" w:hAnsi="Times New Roman" w:cs="Times New Roman"/>
+        </w:rPr>
+      </w:pPr>
+      <w:r>
+        <w:rPr>
+          <w:rFonts w:ascii="Times New Roman" w:hAnsi="Times New Roman" w:cs="Times New Roman"/>
+        </w:rPr>
+        <w:t>Rim Locks</w:t>
+      </w:r>
+    </w:p>
+    <w:p>
+      <w:pPr>
+        <w:pStyle w:val="ListParagraph"/>
+        <w:numPr>
+          <w:ilvl w:val="0"/>
+          <w:numId w:val="2"/>
+        </w:numPr>
+        <w:jc w:val="both"/>
+        <w:rPr>
+          <w:rFonts w:ascii="Times New Roman" w:hAnsi="Times New Roman" w:cs="Times New Roman"/>
+        </w:rPr>
+      </w:pPr>
+      <w:r>
+        <w:rPr>
+          <w:rFonts w:ascii="Times New Roman" w:hAnsi="Times New Roman" w:cs="Times New Roman"/>
+        </w:rPr>
+        <w:t>Euro Profile Cylinders</w:t>
+      </w:r>
+    </w:p>
+    <w:p>
+      <w:pPr>
+        <w:pStyle w:val="ListParagraph"/>
+        <w:numPr>
+          <w:ilvl w:val="0"/>
+          <w:numId w:val="2"/>
+        </w:numPr>
+        <w:jc w:val="both"/>
+        <w:rPr>
+          <w:rFonts w:ascii="Times New Roman" w:hAnsi="Times New Roman" w:cs="Times New Roman"/>
+        </w:rPr>
+      </w:pPr>
+      <w:r>
+        <w:rPr>
+          <w:rFonts w:ascii="Times New Roman" w:hAnsi="Times New Roman" w:cs="Times New Roman"/>
+        </w:rPr>
+        <w:t>Lock boxes</w:t>
+      </w:r>
+    </w:p>
+    <w:p>
+      <w:pPr>
+        <w:jc w:val="both"/>
+        <w:rPr>
+          <w:rFonts w:ascii="Times New Roman" w:hAnsi="Times New Roman" w:cs="Times New Roman"/>
+        </w:rPr>
+      </w:pPr>
+      <w:r>
+        <w:rPr>
+          <w:rFonts w:ascii="Times New Roman" w:hAnsi="Times New Roman" w:cs="Times New Roman"/>
+        </w:rPr>
+        <w:t>A18. Discover two hallucination cases when using a generative AI system.</w:t>
+      </w:r>
+    </w:p>
+    <w:p>
+      <w:pPr>
+        <w:jc w:val="both"/>
+        <w:rPr>
+          <w:rFonts w:ascii="Times New Roman" w:hAnsi="Times New Roman" w:cs="Times New Roman"/>
+          <w:b/>
+          <w:bCs/>
+        </w:rPr>
+      </w:pPr>
+      <w:r>
+        <w:rPr>
+          <w:rFonts w:ascii="Times New Roman" w:hAnsi="Times New Roman" w:cs="Times New Roman"/>
+          <w:b/>
+          <w:bCs/>
+        </w:rPr>
         <w:t>A19. Join a CS/DS/cybersecurity club.</w:t>
       </w:r>
     </w:p>
@@ -963,6 +2283,31 @@
     </w:p>
     <w:p>
       <w:pPr>
+        <w:pStyle w:val="ListParagraph"/>
+        <w:numPr>
+          <w:ilvl w:val="0"/>
+          <w:numId w:val="1"/>
+        </w:numPr>
+        <w:jc w:val="both"/>
+        <w:rPr>
+          <w:rFonts w:ascii="Times New Roman" w:hAnsi="Times New Roman" w:cs="Times New Roman"/>
+        </w:rPr>
+      </w:pPr>
+      <w:r>
+        <w:rPr>
+          <w:rFonts w:ascii="Times New Roman" w:hAnsi="Times New Roman" w:cs="Times New Roman"/>
+        </w:rPr>
+        <w:t>“Cybersecurity event” i.e. like a seminar/talk or occurrence of a system indicating a possible breach of security polic</w:t>
+      </w:r>
+      <w:r>
+        <w:rPr>
+          <w:rFonts w:ascii="Times New Roman" w:hAnsi="Times New Roman" w:cs="Times New Roman"/>
+        </w:rPr>
+        <w:t>y?</w:t>
+      </w:r>
+    </w:p>
+    <w:p>
+      <w:pPr>
         <w:jc w:val="both"/>
         <w:rPr>
           <w:rFonts w:ascii="Times New Roman" w:hAnsi="Times New Roman" w:cs="Times New Roman"/>
@@ -1056,6 +2401,7 @@
         <w:rPr>
           <w:rFonts w:ascii="Times New Roman" w:hAnsi="Times New Roman" w:cs="Times New Roman"/>
         </w:rPr>
+        <w:lastRenderedPageBreak/>
         <w:t>A27. Research and implement a system vulnerability.</w:t>
       </w:r>
     </w:p>
@@ -1109,6 +2455,635 @@
     </w:sectPr>
   </w:body>
 </w:document>
+</file>
+
+<file path=word/numbering.xml><?xml version="1.0" encoding="utf-8"?>
+<w:numbering xmlns:wpc="http://schemas.microsoft.com/office/word/2010/wordprocessingCanvas" xmlns:cx="http://schemas.microsoft.com/office/drawing/2014/chartex" xmlns:cx1="http://schemas.microsoft.com/office/drawing/2015/9/8/chartex" xmlns:cx2="http://schemas.microsoft.com/office/drawing/2015/10/21/chartex" xmlns:cx3="http://schemas.microsoft.com/office/drawing/2016/5/9/chartex" xmlns:cx4="http://schemas.microsoft.com/office/drawing/2016/5/10/chartex" xmlns:cx5="http://schemas.microsoft.com/office/drawing/2016/5/11/chartex" xmlns:cx6="http://schemas.microsoft.com/office/drawing/2016/5/12/chartex" xmlns:cx7="http://schemas.microsoft.com/office/drawing/2016/5/13/chartex" xmlns:cx8="http://schemas.microsoft.com/office/drawing/2016/5/14/chartex" xmlns:mc="http://schemas.openxmlformats.org/markup-compatibility/2006" xmlns:aink="http://schemas.microsoft.com/office/drawing/2016/ink" xmlns:am3d="http://schemas.microsoft.com/office/drawing/2017/model3d" xmlns:o="urn:schemas-microsoft-com:office:office" xmlns:oel="http://schemas.microsoft.com/office/2019/extlst" xmlns:r="http://schemas.openxmlformats.org/officeDocument/2006/relationships" xmlns:m="http://schemas.openxmlformats.org/officeDocument/2006/math" xmlns:v="urn:schemas-microsoft-com:vml" xmlns:wp14="http://schemas.microsoft.com/office/word/2010/wordprocessingDrawing" xmlns:wp="http://schemas.openxmlformats.org/drawingml/2006/wordprocessingDrawing" xmlns:w10="urn:schemas-microsoft-com:office:word" xmlns:w="http://schemas.openxmlformats.org/wordprocessingml/2006/main" xmlns:w14="http://schemas.microsoft.com/office/word/2010/wordml" xmlns:w15="http://schemas.microsoft.com/office/word/2012/wordml" xmlns:w16cex="http://schemas.microsoft.com/office/word/2018/wordml/cex" xmlns:w16cid="http://schemas.microsoft.com/office/word/2016/wordml/cid" xmlns:w16="http://schemas.microsoft.com/office/word/2018/wordml" xmlns:w16du="http://schemas.microsoft.com/office/word/2023/wordml/word16du" xmlns:w16sdtdh="http://schemas.microsoft.com/office/word/2020/wordml/sdtdatahash" xmlns:w16sdtfl="http://schemas.microsoft.com/office/word/2024/wordml/sdtformatlock" xmlns:w16se="http://schemas.microsoft.com/office/word/2015/wordml/symex" xmlns:wpg="http://schemas.microsoft.com/office/word/2010/wordprocessingGroup" xmlns:wpi="http://schemas.microsoft.com/office/word/2010/wordprocessingInk" xmlns:wne="http://schemas.microsoft.com/office/word/2006/wordml" xmlns:wps="http://schemas.microsoft.com/office/word/2010/wordprocessingShape" mc:Ignorable="w14 w15 w16se w16cid w16 w16cex w16sdtdh w16sdtfl w16du wp14">
+  <w:abstractNum w:abstractNumId="0" w15:restartNumberingAfterBreak="0">
+    <w:nsid w:val="2E8857A0"/>
+    <w:multiLevelType w:val="hybridMultilevel"/>
+    <w:tmpl w:val="E0B2A350"/>
+    <w:lvl w:ilvl="0" w:tplc="3988667A">
+      <w:start w:val="1"/>
+      <w:numFmt w:val="bullet"/>
+      <w:lvlText w:val="-"/>
+      <w:lvlJc w:val="left"/>
+      <w:pPr>
+        <w:ind w:left="720" w:hanging="360"/>
+      </w:pPr>
+      <w:rPr>
+        <w:rFonts w:ascii="Times New Roman" w:eastAsiaTheme="minorEastAsia" w:hAnsi="Times New Roman" w:cs="Times New Roman" w:hint="default"/>
+      </w:rPr>
+    </w:lvl>
+    <w:lvl w:ilvl="1" w:tplc="38090003" w:tentative="1">
+      <w:start w:val="1"/>
+      <w:numFmt w:val="bullet"/>
+      <w:lvlText w:val="o"/>
+      <w:lvlJc w:val="left"/>
+      <w:pPr>
+        <w:ind w:left="1440" w:hanging="360"/>
+      </w:pPr>
+      <w:rPr>
+        <w:rFonts w:ascii="Courier New" w:hAnsi="Courier New" w:cs="Courier New" w:hint="default"/>
+      </w:rPr>
+    </w:lvl>
+    <w:lvl w:ilvl="2" w:tplc="38090005" w:tentative="1">
+      <w:start w:val="1"/>
+      <w:numFmt w:val="bullet"/>
+      <w:lvlText w:val=""/>
+      <w:lvlJc w:val="left"/>
+      <w:pPr>
+        <w:ind w:left="2160" w:hanging="360"/>
+      </w:pPr>
+      <w:rPr>
+        <w:rFonts w:ascii="Wingdings" w:hAnsi="Wingdings" w:hint="default"/>
+      </w:rPr>
+    </w:lvl>
+    <w:lvl w:ilvl="3" w:tplc="38090001" w:tentative="1">
+      <w:start w:val="1"/>
+      <w:numFmt w:val="bullet"/>
+      <w:lvlText w:val=""/>
+      <w:lvlJc w:val="left"/>
+      <w:pPr>
+        <w:ind w:left="2880" w:hanging="360"/>
+      </w:pPr>
+      <w:rPr>
+        <w:rFonts w:ascii="Symbol" w:hAnsi="Symbol" w:hint="default"/>
+      </w:rPr>
+    </w:lvl>
+    <w:lvl w:ilvl="4" w:tplc="38090003" w:tentative="1">
+      <w:start w:val="1"/>
+      <w:numFmt w:val="bullet"/>
+      <w:lvlText w:val="o"/>
+      <w:lvlJc w:val="left"/>
+      <w:pPr>
+        <w:ind w:left="3600" w:hanging="360"/>
+      </w:pPr>
+      <w:rPr>
+        <w:rFonts w:ascii="Courier New" w:hAnsi="Courier New" w:cs="Courier New" w:hint="default"/>
+      </w:rPr>
+    </w:lvl>
+    <w:lvl w:ilvl="5" w:tplc="38090005" w:tentative="1">
+      <w:start w:val="1"/>
+      <w:numFmt w:val="bullet"/>
+      <w:lvlText w:val=""/>
+      <w:lvlJc w:val="left"/>
+      <w:pPr>
+        <w:ind w:left="4320" w:hanging="360"/>
+      </w:pPr>
+      <w:rPr>
+        <w:rFonts w:ascii="Wingdings" w:hAnsi="Wingdings" w:hint="default"/>
+      </w:rPr>
+    </w:lvl>
+    <w:lvl w:ilvl="6" w:tplc="38090001" w:tentative="1">
+      <w:start w:val="1"/>
+      <w:numFmt w:val="bullet"/>
+      <w:lvlText w:val=""/>
+      <w:lvlJc w:val="left"/>
+      <w:pPr>
+        <w:ind w:left="5040" w:hanging="360"/>
+      </w:pPr>
+      <w:rPr>
+        <w:rFonts w:ascii="Symbol" w:hAnsi="Symbol" w:hint="default"/>
+      </w:rPr>
+    </w:lvl>
+    <w:lvl w:ilvl="7" w:tplc="38090003" w:tentative="1">
+      <w:start w:val="1"/>
+      <w:numFmt w:val="bullet"/>
+      <w:lvlText w:val="o"/>
+      <w:lvlJc w:val="left"/>
+      <w:pPr>
+        <w:ind w:left="5760" w:hanging="360"/>
+      </w:pPr>
+      <w:rPr>
+        <w:rFonts w:ascii="Courier New" w:hAnsi="Courier New" w:cs="Courier New" w:hint="default"/>
+      </w:rPr>
+    </w:lvl>
+    <w:lvl w:ilvl="8" w:tplc="38090005" w:tentative="1">
+      <w:start w:val="1"/>
+      <w:numFmt w:val="bullet"/>
+      <w:lvlText w:val=""/>
+      <w:lvlJc w:val="left"/>
+      <w:pPr>
+        <w:ind w:left="6480" w:hanging="360"/>
+      </w:pPr>
+      <w:rPr>
+        <w:rFonts w:ascii="Wingdings" w:hAnsi="Wingdings" w:hint="default"/>
+      </w:rPr>
+    </w:lvl>
+  </w:abstractNum>
+  <w:abstractNum w:abstractNumId="1" w15:restartNumberingAfterBreak="0">
+    <w:nsid w:val="43014E50"/>
+    <w:multiLevelType w:val="hybridMultilevel"/>
+    <w:tmpl w:val="3362BD9A"/>
+    <w:lvl w:ilvl="0" w:tplc="3809000F">
+      <w:start w:val="1"/>
+      <w:numFmt w:val="decimal"/>
+      <w:lvlText w:val="%1."/>
+      <w:lvlJc w:val="left"/>
+      <w:pPr>
+        <w:ind w:left="720" w:hanging="360"/>
+      </w:pPr>
+      <w:rPr>
+        <w:rFonts w:hint="default"/>
+      </w:rPr>
+    </w:lvl>
+    <w:lvl w:ilvl="1" w:tplc="38090019" w:tentative="1">
+      <w:start w:val="1"/>
+      <w:numFmt w:val="lowerLetter"/>
+      <w:lvlText w:val="%2."/>
+      <w:lvlJc w:val="left"/>
+      <w:pPr>
+        <w:ind w:left="1440" w:hanging="360"/>
+      </w:pPr>
+    </w:lvl>
+    <w:lvl w:ilvl="2" w:tplc="3809001B" w:tentative="1">
+      <w:start w:val="1"/>
+      <w:numFmt w:val="lowerRoman"/>
+      <w:lvlText w:val="%3."/>
+      <w:lvlJc w:val="right"/>
+      <w:pPr>
+        <w:ind w:left="2160" w:hanging="180"/>
+      </w:pPr>
+    </w:lvl>
+    <w:lvl w:ilvl="3" w:tplc="3809000F" w:tentative="1">
+      <w:start w:val="1"/>
+      <w:numFmt w:val="decimal"/>
+      <w:lvlText w:val="%4."/>
+      <w:lvlJc w:val="left"/>
+      <w:pPr>
+        <w:ind w:left="2880" w:hanging="360"/>
+      </w:pPr>
+    </w:lvl>
+    <w:lvl w:ilvl="4" w:tplc="38090019" w:tentative="1">
+      <w:start w:val="1"/>
+      <w:numFmt w:val="lowerLetter"/>
+      <w:lvlText w:val="%5."/>
+      <w:lvlJc w:val="left"/>
+      <w:pPr>
+        <w:ind w:left="3600" w:hanging="360"/>
+      </w:pPr>
+    </w:lvl>
+    <w:lvl w:ilvl="5" w:tplc="3809001B" w:tentative="1">
+      <w:start w:val="1"/>
+      <w:numFmt w:val="lowerRoman"/>
+      <w:lvlText w:val="%6."/>
+      <w:lvlJc w:val="right"/>
+      <w:pPr>
+        <w:ind w:left="4320" w:hanging="180"/>
+      </w:pPr>
+    </w:lvl>
+    <w:lvl w:ilvl="6" w:tplc="3809000F" w:tentative="1">
+      <w:start w:val="1"/>
+      <w:numFmt w:val="decimal"/>
+      <w:lvlText w:val="%7."/>
+      <w:lvlJc w:val="left"/>
+      <w:pPr>
+        <w:ind w:left="5040" w:hanging="360"/>
+      </w:pPr>
+    </w:lvl>
+    <w:lvl w:ilvl="7" w:tplc="38090019" w:tentative="1">
+      <w:start w:val="1"/>
+      <w:numFmt w:val="lowerLetter"/>
+      <w:lvlText w:val="%8."/>
+      <w:lvlJc w:val="left"/>
+      <w:pPr>
+        <w:ind w:left="5760" w:hanging="360"/>
+      </w:pPr>
+    </w:lvl>
+    <w:lvl w:ilvl="8" w:tplc="3809001B" w:tentative="1">
+      <w:start w:val="1"/>
+      <w:numFmt w:val="lowerRoman"/>
+      <w:lvlText w:val="%9."/>
+      <w:lvlJc w:val="right"/>
+      <w:pPr>
+        <w:ind w:left="6480" w:hanging="180"/>
+      </w:pPr>
+    </w:lvl>
+  </w:abstractNum>
+  <w:abstractNum w:abstractNumId="2" w15:restartNumberingAfterBreak="0">
+    <w:nsid w:val="45662868"/>
+    <w:multiLevelType w:val="hybridMultilevel"/>
+    <w:tmpl w:val="109CB77C"/>
+    <w:lvl w:ilvl="0" w:tplc="38090001">
+      <w:start w:val="1"/>
+      <w:numFmt w:val="bullet"/>
+      <w:lvlText w:val=""/>
+      <w:lvlJc w:val="left"/>
+      <w:pPr>
+        <w:ind w:left="720" w:hanging="360"/>
+      </w:pPr>
+      <w:rPr>
+        <w:rFonts w:ascii="Symbol" w:hAnsi="Symbol" w:hint="default"/>
+      </w:rPr>
+    </w:lvl>
+    <w:lvl w:ilvl="1" w:tplc="38090003" w:tentative="1">
+      <w:start w:val="1"/>
+      <w:numFmt w:val="bullet"/>
+      <w:lvlText w:val="o"/>
+      <w:lvlJc w:val="left"/>
+      <w:pPr>
+        <w:ind w:left="1440" w:hanging="360"/>
+      </w:pPr>
+      <w:rPr>
+        <w:rFonts w:ascii="Courier New" w:hAnsi="Courier New" w:cs="Courier New" w:hint="default"/>
+      </w:rPr>
+    </w:lvl>
+    <w:lvl w:ilvl="2" w:tplc="38090005" w:tentative="1">
+      <w:start w:val="1"/>
+      <w:numFmt w:val="bullet"/>
+      <w:lvlText w:val=""/>
+      <w:lvlJc w:val="left"/>
+      <w:pPr>
+        <w:ind w:left="2160" w:hanging="360"/>
+      </w:pPr>
+      <w:rPr>
+        <w:rFonts w:ascii="Wingdings" w:hAnsi="Wingdings" w:hint="default"/>
+      </w:rPr>
+    </w:lvl>
+    <w:lvl w:ilvl="3" w:tplc="38090001" w:tentative="1">
+      <w:start w:val="1"/>
+      <w:numFmt w:val="bullet"/>
+      <w:lvlText w:val=""/>
+      <w:lvlJc w:val="left"/>
+      <w:pPr>
+        <w:ind w:left="2880" w:hanging="360"/>
+      </w:pPr>
+      <w:rPr>
+        <w:rFonts w:ascii="Symbol" w:hAnsi="Symbol" w:hint="default"/>
+      </w:rPr>
+    </w:lvl>
+    <w:lvl w:ilvl="4" w:tplc="38090003" w:tentative="1">
+      <w:start w:val="1"/>
+      <w:numFmt w:val="bullet"/>
+      <w:lvlText w:val="o"/>
+      <w:lvlJc w:val="left"/>
+      <w:pPr>
+        <w:ind w:left="3600" w:hanging="360"/>
+      </w:pPr>
+      <w:rPr>
+        <w:rFonts w:ascii="Courier New" w:hAnsi="Courier New" w:cs="Courier New" w:hint="default"/>
+      </w:rPr>
+    </w:lvl>
+    <w:lvl w:ilvl="5" w:tplc="38090005" w:tentative="1">
+      <w:start w:val="1"/>
+      <w:numFmt w:val="bullet"/>
+      <w:lvlText w:val=""/>
+      <w:lvlJc w:val="left"/>
+      <w:pPr>
+        <w:ind w:left="4320" w:hanging="360"/>
+      </w:pPr>
+      <w:rPr>
+        <w:rFonts w:ascii="Wingdings" w:hAnsi="Wingdings" w:hint="default"/>
+      </w:rPr>
+    </w:lvl>
+    <w:lvl w:ilvl="6" w:tplc="38090001" w:tentative="1">
+      <w:start w:val="1"/>
+      <w:numFmt w:val="bullet"/>
+      <w:lvlText w:val=""/>
+      <w:lvlJc w:val="left"/>
+      <w:pPr>
+        <w:ind w:left="5040" w:hanging="360"/>
+      </w:pPr>
+      <w:rPr>
+        <w:rFonts w:ascii="Symbol" w:hAnsi="Symbol" w:hint="default"/>
+      </w:rPr>
+    </w:lvl>
+    <w:lvl w:ilvl="7" w:tplc="38090003" w:tentative="1">
+      <w:start w:val="1"/>
+      <w:numFmt w:val="bullet"/>
+      <w:lvlText w:val="o"/>
+      <w:lvlJc w:val="left"/>
+      <w:pPr>
+        <w:ind w:left="5760" w:hanging="360"/>
+      </w:pPr>
+      <w:rPr>
+        <w:rFonts w:ascii="Courier New" w:hAnsi="Courier New" w:cs="Courier New" w:hint="default"/>
+      </w:rPr>
+    </w:lvl>
+    <w:lvl w:ilvl="8" w:tplc="38090005" w:tentative="1">
+      <w:start w:val="1"/>
+      <w:numFmt w:val="bullet"/>
+      <w:lvlText w:val=""/>
+      <w:lvlJc w:val="left"/>
+      <w:pPr>
+        <w:ind w:left="6480" w:hanging="360"/>
+      </w:pPr>
+      <w:rPr>
+        <w:rFonts w:ascii="Wingdings" w:hAnsi="Wingdings" w:hint="default"/>
+      </w:rPr>
+    </w:lvl>
+  </w:abstractNum>
+  <w:abstractNum w:abstractNumId="3" w15:restartNumberingAfterBreak="0">
+    <w:nsid w:val="4D171DD0"/>
+    <w:multiLevelType w:val="hybridMultilevel"/>
+    <w:tmpl w:val="4FDE5338"/>
+    <w:lvl w:ilvl="0" w:tplc="3809000F">
+      <w:start w:val="1"/>
+      <w:numFmt w:val="decimal"/>
+      <w:lvlText w:val="%1."/>
+      <w:lvlJc w:val="left"/>
+      <w:pPr>
+        <w:ind w:left="720" w:hanging="360"/>
+      </w:pPr>
+      <w:rPr>
+        <w:rFonts w:hint="default"/>
+      </w:rPr>
+    </w:lvl>
+    <w:lvl w:ilvl="1" w:tplc="38090019" w:tentative="1">
+      <w:start w:val="1"/>
+      <w:numFmt w:val="lowerLetter"/>
+      <w:lvlText w:val="%2."/>
+      <w:lvlJc w:val="left"/>
+      <w:pPr>
+        <w:ind w:left="1440" w:hanging="360"/>
+      </w:pPr>
+    </w:lvl>
+    <w:lvl w:ilvl="2" w:tplc="3809001B" w:tentative="1">
+      <w:start w:val="1"/>
+      <w:numFmt w:val="lowerRoman"/>
+      <w:lvlText w:val="%3."/>
+      <w:lvlJc w:val="right"/>
+      <w:pPr>
+        <w:ind w:left="2160" w:hanging="180"/>
+      </w:pPr>
+    </w:lvl>
+    <w:lvl w:ilvl="3" w:tplc="3809000F" w:tentative="1">
+      <w:start w:val="1"/>
+      <w:numFmt w:val="decimal"/>
+      <w:lvlText w:val="%4."/>
+      <w:lvlJc w:val="left"/>
+      <w:pPr>
+        <w:ind w:left="2880" w:hanging="360"/>
+      </w:pPr>
+    </w:lvl>
+    <w:lvl w:ilvl="4" w:tplc="38090019" w:tentative="1">
+      <w:start w:val="1"/>
+      <w:numFmt w:val="lowerLetter"/>
+      <w:lvlText w:val="%5."/>
+      <w:lvlJc w:val="left"/>
+      <w:pPr>
+        <w:ind w:left="3600" w:hanging="360"/>
+      </w:pPr>
+    </w:lvl>
+    <w:lvl w:ilvl="5" w:tplc="3809001B" w:tentative="1">
+      <w:start w:val="1"/>
+      <w:numFmt w:val="lowerRoman"/>
+      <w:lvlText w:val="%6."/>
+      <w:lvlJc w:val="right"/>
+      <w:pPr>
+        <w:ind w:left="4320" w:hanging="180"/>
+      </w:pPr>
+    </w:lvl>
+    <w:lvl w:ilvl="6" w:tplc="3809000F" w:tentative="1">
+      <w:start w:val="1"/>
+      <w:numFmt w:val="decimal"/>
+      <w:lvlText w:val="%7."/>
+      <w:lvlJc w:val="left"/>
+      <w:pPr>
+        <w:ind w:left="5040" w:hanging="360"/>
+      </w:pPr>
+    </w:lvl>
+    <w:lvl w:ilvl="7" w:tplc="38090019" w:tentative="1">
+      <w:start w:val="1"/>
+      <w:numFmt w:val="lowerLetter"/>
+      <w:lvlText w:val="%8."/>
+      <w:lvlJc w:val="left"/>
+      <w:pPr>
+        <w:ind w:left="5760" w:hanging="360"/>
+      </w:pPr>
+    </w:lvl>
+    <w:lvl w:ilvl="8" w:tplc="3809001B" w:tentative="1">
+      <w:start w:val="1"/>
+      <w:numFmt w:val="lowerRoman"/>
+      <w:lvlText w:val="%9."/>
+      <w:lvlJc w:val="right"/>
+      <w:pPr>
+        <w:ind w:left="6480" w:hanging="180"/>
+      </w:pPr>
+    </w:lvl>
+  </w:abstractNum>
+  <w:abstractNum w:abstractNumId="4" w15:restartNumberingAfterBreak="0">
+    <w:nsid w:val="4FC80417"/>
+    <w:multiLevelType w:val="hybridMultilevel"/>
+    <w:tmpl w:val="C84CC106"/>
+    <w:lvl w:ilvl="0" w:tplc="600AF7AA">
+      <w:start w:val="1"/>
+      <w:numFmt w:val="decimal"/>
+      <w:lvlText w:val="%1."/>
+      <w:lvlJc w:val="left"/>
+      <w:pPr>
+        <w:ind w:left="1080" w:hanging="360"/>
+      </w:pPr>
+      <w:rPr>
+        <w:rFonts w:hint="default"/>
+      </w:rPr>
+    </w:lvl>
+    <w:lvl w:ilvl="1" w:tplc="38090019" w:tentative="1">
+      <w:start w:val="1"/>
+      <w:numFmt w:val="lowerLetter"/>
+      <w:lvlText w:val="%2."/>
+      <w:lvlJc w:val="left"/>
+      <w:pPr>
+        <w:ind w:left="1800" w:hanging="360"/>
+      </w:pPr>
+    </w:lvl>
+    <w:lvl w:ilvl="2" w:tplc="3809001B" w:tentative="1">
+      <w:start w:val="1"/>
+      <w:numFmt w:val="lowerRoman"/>
+      <w:lvlText w:val="%3."/>
+      <w:lvlJc w:val="right"/>
+      <w:pPr>
+        <w:ind w:left="2520" w:hanging="180"/>
+      </w:pPr>
+    </w:lvl>
+    <w:lvl w:ilvl="3" w:tplc="3809000F" w:tentative="1">
+      <w:start w:val="1"/>
+      <w:numFmt w:val="decimal"/>
+      <w:lvlText w:val="%4."/>
+      <w:lvlJc w:val="left"/>
+      <w:pPr>
+        <w:ind w:left="3240" w:hanging="360"/>
+      </w:pPr>
+    </w:lvl>
+    <w:lvl w:ilvl="4" w:tplc="38090019" w:tentative="1">
+      <w:start w:val="1"/>
+      <w:numFmt w:val="lowerLetter"/>
+      <w:lvlText w:val="%5."/>
+      <w:lvlJc w:val="left"/>
+      <w:pPr>
+        <w:ind w:left="3960" w:hanging="360"/>
+      </w:pPr>
+    </w:lvl>
+    <w:lvl w:ilvl="5" w:tplc="3809001B" w:tentative="1">
+      <w:start w:val="1"/>
+      <w:numFmt w:val="lowerRoman"/>
+      <w:lvlText w:val="%6."/>
+      <w:lvlJc w:val="right"/>
+      <w:pPr>
+        <w:ind w:left="4680" w:hanging="180"/>
+      </w:pPr>
+    </w:lvl>
+    <w:lvl w:ilvl="6" w:tplc="3809000F" w:tentative="1">
+      <w:start w:val="1"/>
+      <w:numFmt w:val="decimal"/>
+      <w:lvlText w:val="%7."/>
+      <w:lvlJc w:val="left"/>
+      <w:pPr>
+        <w:ind w:left="5400" w:hanging="360"/>
+      </w:pPr>
+    </w:lvl>
+    <w:lvl w:ilvl="7" w:tplc="38090019" w:tentative="1">
+      <w:start w:val="1"/>
+      <w:numFmt w:val="lowerLetter"/>
+      <w:lvlText w:val="%8."/>
+      <w:lvlJc w:val="left"/>
+      <w:pPr>
+        <w:ind w:left="6120" w:hanging="360"/>
+      </w:pPr>
+    </w:lvl>
+    <w:lvl w:ilvl="8" w:tplc="3809001B" w:tentative="1">
+      <w:start w:val="1"/>
+      <w:numFmt w:val="lowerRoman"/>
+      <w:lvlText w:val="%9."/>
+      <w:lvlJc w:val="right"/>
+      <w:pPr>
+        <w:ind w:left="6840" w:hanging="180"/>
+      </w:pPr>
+    </w:lvl>
+  </w:abstractNum>
+  <w:abstractNum w:abstractNumId="5" w15:restartNumberingAfterBreak="0">
+    <w:nsid w:val="6B295647"/>
+    <w:multiLevelType w:val="hybridMultilevel"/>
+    <w:tmpl w:val="DF6E3A24"/>
+    <w:lvl w:ilvl="0" w:tplc="AF60742A">
+      <w:start w:val="1"/>
+      <w:numFmt w:val="bullet"/>
+      <w:lvlText w:val="-"/>
+      <w:lvlJc w:val="left"/>
+      <w:pPr>
+        <w:ind w:left="720" w:hanging="360"/>
+      </w:pPr>
+      <w:rPr>
+        <w:rFonts w:ascii="Times New Roman" w:eastAsiaTheme="minorEastAsia" w:hAnsi="Times New Roman" w:cs="Times New Roman" w:hint="default"/>
+      </w:rPr>
+    </w:lvl>
+    <w:lvl w:ilvl="1" w:tplc="38090003" w:tentative="1">
+      <w:start w:val="1"/>
+      <w:numFmt w:val="bullet"/>
+      <w:lvlText w:val="o"/>
+      <w:lvlJc w:val="left"/>
+      <w:pPr>
+        <w:ind w:left="1440" w:hanging="360"/>
+      </w:pPr>
+      <w:rPr>
+        <w:rFonts w:ascii="Courier New" w:hAnsi="Courier New" w:cs="Courier New" w:hint="default"/>
+      </w:rPr>
+    </w:lvl>
+    <w:lvl w:ilvl="2" w:tplc="38090005" w:tentative="1">
+      <w:start w:val="1"/>
+      <w:numFmt w:val="bullet"/>
+      <w:lvlText w:val=""/>
+      <w:lvlJc w:val="left"/>
+      <w:pPr>
+        <w:ind w:left="2160" w:hanging="360"/>
+      </w:pPr>
+      <w:rPr>
+        <w:rFonts w:ascii="Wingdings" w:hAnsi="Wingdings" w:hint="default"/>
+      </w:rPr>
+    </w:lvl>
+    <w:lvl w:ilvl="3" w:tplc="38090001" w:tentative="1">
+      <w:start w:val="1"/>
+      <w:numFmt w:val="bullet"/>
+      <w:lvlText w:val=""/>
+      <w:lvlJc w:val="left"/>
+      <w:pPr>
+        <w:ind w:left="2880" w:hanging="360"/>
+      </w:pPr>
+      <w:rPr>
+        <w:rFonts w:ascii="Symbol" w:hAnsi="Symbol" w:hint="default"/>
+      </w:rPr>
+    </w:lvl>
+    <w:lvl w:ilvl="4" w:tplc="38090003" w:tentative="1">
+      <w:start w:val="1"/>
+      <w:numFmt w:val="bullet"/>
+      <w:lvlText w:val="o"/>
+      <w:lvlJc w:val="left"/>
+      <w:pPr>
+        <w:ind w:left="3600" w:hanging="360"/>
+      </w:pPr>
+      <w:rPr>
+        <w:rFonts w:ascii="Courier New" w:hAnsi="Courier New" w:cs="Courier New" w:hint="default"/>
+      </w:rPr>
+    </w:lvl>
+    <w:lvl w:ilvl="5" w:tplc="38090005" w:tentative="1">
+      <w:start w:val="1"/>
+      <w:numFmt w:val="bullet"/>
+      <w:lvlText w:val=""/>
+      <w:lvlJc w:val="left"/>
+      <w:pPr>
+        <w:ind w:left="4320" w:hanging="360"/>
+      </w:pPr>
+      <w:rPr>
+        <w:rFonts w:ascii="Wingdings" w:hAnsi="Wingdings" w:hint="default"/>
+      </w:rPr>
+    </w:lvl>
+    <w:lvl w:ilvl="6" w:tplc="38090001" w:tentative="1">
+      <w:start w:val="1"/>
+      <w:numFmt w:val="bullet"/>
+      <w:lvlText w:val=""/>
+      <w:lvlJc w:val="left"/>
+      <w:pPr>
+        <w:ind w:left="5040" w:hanging="360"/>
+      </w:pPr>
+      <w:rPr>
+        <w:rFonts w:ascii="Symbol" w:hAnsi="Symbol" w:hint="default"/>
+      </w:rPr>
+    </w:lvl>
+    <w:lvl w:ilvl="7" w:tplc="38090003" w:tentative="1">
+      <w:start w:val="1"/>
+      <w:numFmt w:val="bullet"/>
+      <w:lvlText w:val="o"/>
+      <w:lvlJc w:val="left"/>
+      <w:pPr>
+        <w:ind w:left="5760" w:hanging="360"/>
+      </w:pPr>
+      <w:rPr>
+        <w:rFonts w:ascii="Courier New" w:hAnsi="Courier New" w:cs="Courier New" w:hint="default"/>
+      </w:rPr>
+    </w:lvl>
+    <w:lvl w:ilvl="8" w:tplc="38090005" w:tentative="1">
+      <w:start w:val="1"/>
+      <w:numFmt w:val="bullet"/>
+      <w:lvlText w:val=""/>
+      <w:lvlJc w:val="left"/>
+      <w:pPr>
+        <w:ind w:left="6480" w:hanging="360"/>
+      </w:pPr>
+      <w:rPr>
+        <w:rFonts w:ascii="Wingdings" w:hAnsi="Wingdings" w:hint="default"/>
+      </w:rPr>
+    </w:lvl>
+  </w:abstractNum>
+  <w:num w:numId="1" w16cid:durableId="160194805">
+    <w:abstractNumId w:val="2"/>
+  </w:num>
+  <w:num w:numId="2" w16cid:durableId="1360665996">
+    <w:abstractNumId w:val="3"/>
+  </w:num>
+  <w:num w:numId="3" w16cid:durableId="1771852396">
+    <w:abstractNumId w:val="4"/>
+  </w:num>
+  <w:num w:numId="4" w16cid:durableId="1183282507">
+    <w:abstractNumId w:val="1"/>
+  </w:num>
+  <w:num w:numId="5" w16cid:durableId="1308901684">
+    <w:abstractNumId w:val="0"/>
+  </w:num>
+  <w:num w:numId="6" w16cid:durableId="166138128">
+    <w:abstractNumId w:val="5"/>
+  </w:num>
+</w:numbering>
 </file>
 
 <file path=word/styles.xml><?xml version="1.0" encoding="utf-8"?>

</xml_diff>